<commit_message>
P7 completada con Doc bien hecho. Preguntar duda test00.txt
</commit_message>
<xml_diff>
--- a/p7/P7.docx
+++ b/p7/P7.docx
@@ -1,6 +1,6 @@
 
 <file path=word/document.xml><?xml version="1.0" encoding="utf-8"?>
-<w:document xmlns:wpc="http://schemas.microsoft.com/office/word/2010/wordprocessingCanvas" xmlns:cx="http://schemas.microsoft.com/office/drawing/2014/chartex" xmlns:cx1="http://schemas.microsoft.com/office/drawing/2015/9/8/chartex" xmlns:mc="http://schemas.openxmlformats.org/markup-compatibility/2006" xmlns:o="urn:schemas-microsoft-com:office:office" xmlns:r="http://schemas.openxmlformats.org/officeDocument/2006/relationships" xmlns:m="http://schemas.openxmlformats.org/officeDocument/2006/math" xmlns:v="urn:schemas-microsoft-com:vml" xmlns:wp14="http://schemas.microsoft.com/office/word/2010/wordprocessingDrawing" xmlns:wp="http://schemas.openxmlformats.org/drawingml/2006/wordprocessingDrawing" xmlns:w10="urn:schemas-microsoft-com:office:word" xmlns:w="http://schemas.openxmlformats.org/wordprocessingml/2006/main" xmlns:w14="http://schemas.microsoft.com/office/word/2010/wordml" xmlns:w15="http://schemas.microsoft.com/office/word/2012/wordml" xmlns:w16se="http://schemas.microsoft.com/office/word/2015/wordml/symex" xmlns:wpg="http://schemas.microsoft.com/office/word/2010/wordprocessingGroup" xmlns:wpi="http://schemas.microsoft.com/office/word/2010/wordprocessingInk" xmlns:wne="http://schemas.microsoft.com/office/word/2006/wordml" xmlns:wps="http://schemas.microsoft.com/office/word/2010/wordprocessingShape" mc:Ignorable="w14 w15 w16se wp14">
+<w:document xmlns:wpc="http://schemas.microsoft.com/office/word/2010/wordprocessingCanvas" xmlns:cx="http://schemas.microsoft.com/office/drawing/2014/chartex" xmlns:mc="http://schemas.openxmlformats.org/markup-compatibility/2006" xmlns:o="urn:schemas-microsoft-com:office:office" xmlns:r="http://schemas.openxmlformats.org/officeDocument/2006/relationships" xmlns:m="http://schemas.openxmlformats.org/officeDocument/2006/math" xmlns:v="urn:schemas-microsoft-com:vml" xmlns:wp14="http://schemas.microsoft.com/office/word/2010/wordprocessingDrawing" xmlns:wp="http://schemas.openxmlformats.org/drawingml/2006/wordprocessingDrawing" xmlns:w10="urn:schemas-microsoft-com:office:word" xmlns:w="http://schemas.openxmlformats.org/wordprocessingml/2006/main" xmlns:w14="http://schemas.microsoft.com/office/word/2010/wordml" xmlns:w15="http://schemas.microsoft.com/office/word/2012/wordml" xmlns:w16se="http://schemas.microsoft.com/office/word/2015/wordml/symex" xmlns:wpg="http://schemas.microsoft.com/office/word/2010/wordprocessingGroup" xmlns:wpi="http://schemas.microsoft.com/office/word/2010/wordprocessingInk" xmlns:wne="http://schemas.microsoft.com/office/word/2006/wordml" xmlns:wps="http://schemas.microsoft.com/office/word/2010/wordprocessingShape" mc:Ignorable="w14 w15 w16se wp14">
   <w:body>
     <w:p>
       <w:pPr>
@@ -14367,7 +14367,6 @@
           <w:lang w:val="en-GB" w:eastAsia="es-ES"/>
         </w:rPr>
       </w:pPr>
-      <w:proofErr w:type="gramStart"/>
       <w:r>
         <w:rPr>
           <w:b/>
@@ -14378,13 +14377,160 @@
         <w:lastRenderedPageBreak/>
         <w:t>for</w:t>
       </w:r>
+      <w:r>
+        <w:rPr>
+          <w:b/>
+          <w:sz w:val="24"/>
+          <w:lang w:val="en-GB" w:eastAsia="es-ES"/>
+        </w:rPr>
+        <w:t xml:space="preserve"> (</w:t>
+      </w:r>
+      <w:proofErr w:type="spellStart"/>
+      <w:r>
+        <w:rPr>
+          <w:b/>
+          <w:color w:val="4EC9B0"/>
+          <w:sz w:val="24"/>
+          <w:lang w:val="en-GB" w:eastAsia="es-ES"/>
+        </w:rPr>
+        <w:t>int</w:t>
+      </w:r>
+      <w:proofErr w:type="spellEnd"/>
+      <w:r>
+        <w:rPr>
+          <w:b/>
+          <w:sz w:val="24"/>
+          <w:lang w:val="en-GB" w:eastAsia="es-ES"/>
+        </w:rPr>
+        <w:t xml:space="preserve"> </w:t>
+      </w:r>
+      <w:proofErr w:type="spellStart"/>
+      <w:r>
+        <w:rPr>
+          <w:b/>
+          <w:color w:val="9CDCFE"/>
+          <w:sz w:val="24"/>
+          <w:lang w:val="en-GB" w:eastAsia="es-ES"/>
+        </w:rPr>
+        <w:t>i</w:t>
+      </w:r>
+      <w:proofErr w:type="spellEnd"/>
+      <w:r>
+        <w:rPr>
+          <w:b/>
+          <w:color w:val="D4D4D4"/>
+          <w:sz w:val="24"/>
+          <w:lang w:val="en-GB" w:eastAsia="es-ES"/>
+        </w:rPr>
+        <w:t>=</w:t>
+      </w:r>
+      <w:proofErr w:type="gramStart"/>
+      <w:r>
+        <w:rPr>
+          <w:b/>
+          <w:color w:val="B5CEA8"/>
+          <w:sz w:val="24"/>
+          <w:lang w:val="en-GB" w:eastAsia="es-ES"/>
+        </w:rPr>
+        <w:t>0</w:t>
+      </w:r>
+      <w:r>
+        <w:rPr>
+          <w:b/>
+          <w:sz w:val="24"/>
+          <w:lang w:val="en-GB" w:eastAsia="es-ES"/>
+        </w:rPr>
+        <w:t>;</w:t>
+      </w:r>
+      <w:r>
+        <w:rPr>
+          <w:b/>
+          <w:color w:val="9CDCFE"/>
+          <w:sz w:val="24"/>
+          <w:lang w:val="en-GB" w:eastAsia="es-ES"/>
+        </w:rPr>
+        <w:t>i</w:t>
+      </w:r>
       <w:proofErr w:type="gramEnd"/>
       <w:r>
         <w:rPr>
           <w:b/>
+          <w:color w:val="D4D4D4"/>
           <w:sz w:val="24"/>
           <w:lang w:val="en-GB" w:eastAsia="es-ES"/>
         </w:rPr>
+        <w:t>&lt;</w:t>
+      </w:r>
+      <w:proofErr w:type="spellStart"/>
+      <w:r>
+        <w:rPr>
+          <w:b/>
+          <w:color w:val="9CDCFE"/>
+          <w:sz w:val="24"/>
+          <w:lang w:val="en-GB" w:eastAsia="es-ES"/>
+        </w:rPr>
+        <w:t>n</w:t>
+      </w:r>
+      <w:r>
+        <w:rPr>
+          <w:b/>
+          <w:sz w:val="24"/>
+          <w:lang w:val="en-GB" w:eastAsia="es-ES"/>
+        </w:rPr>
+        <w:t>;</w:t>
+      </w:r>
+      <w:r>
+        <w:rPr>
+          <w:b/>
+          <w:color w:val="9CDCFE"/>
+          <w:sz w:val="24"/>
+          <w:lang w:val="en-GB" w:eastAsia="es-ES"/>
+        </w:rPr>
+        <w:t>i</w:t>
+      </w:r>
+      <w:proofErr w:type="spellEnd"/>
+      <w:r>
+        <w:rPr>
+          <w:b/>
+          <w:color w:val="D4D4D4"/>
+          <w:sz w:val="24"/>
+          <w:lang w:val="en-GB" w:eastAsia="es-ES"/>
+        </w:rPr>
+        <w:t>++</w:t>
+      </w:r>
+      <w:r>
+        <w:rPr>
+          <w:b/>
+          <w:sz w:val="24"/>
+          <w:lang w:val="en-GB" w:eastAsia="es-ES"/>
+        </w:rPr>
+        <w:t>){</w:t>
+      </w:r>
+    </w:p>
+    <w:p>
+      <w:pPr>
+        <w:pStyle w:val="Textoindependienteprimerasangra2"/>
+        <w:rPr>
+          <w:b/>
+          <w:sz w:val="24"/>
+          <w:lang w:val="en-GB" w:eastAsia="es-ES"/>
+        </w:rPr>
+      </w:pPr>
+      <w:r>
+        <w:rPr>
+          <w:b/>
+          <w:color w:val="C586C0"/>
+          <w:sz w:val="24"/>
+          <w:lang w:val="en-GB" w:eastAsia="es-ES"/>
+        </w:rPr>
+        <w:t>for</w:t>
+      </w:r>
+      <w:r>
+        <w:rPr>
+          <w:b/>
+          <w:sz w:val="24"/>
+          <w:lang w:val="en-GB" w:eastAsia="es-ES"/>
+        </w:rPr>
         <w:t xml:space="preserve"> (</w:t>
       </w:r>
       <w:proofErr w:type="spellStart"/>
@@ -14406,7 +14552,6 @@
         </w:rPr>
         <w:t xml:space="preserve"> </w:t>
       </w:r>
-      <w:proofErr w:type="spellStart"/>
       <w:r>
         <w:rPr>
           <w:b/>
@@ -14414,9 +14559,8 @@
           <w:sz w:val="24"/>
           <w:lang w:val="en-GB" w:eastAsia="es-ES"/>
         </w:rPr>
-        <w:t>i</w:t>
-      </w:r>
-      <w:proofErr w:type="spellEnd"/>
+        <w:t>j</w:t>
+      </w:r>
       <w:r>
         <w:rPr>
           <w:b/>
@@ -14426,6 +14570,7 @@
         </w:rPr>
         <w:t>=</w:t>
       </w:r>
+      <w:proofErr w:type="gramStart"/>
       <w:r>
         <w:rPr>
           <w:b/>
@@ -14450,154 +14595,9 @@
           <w:sz w:val="24"/>
           <w:lang w:val="en-GB" w:eastAsia="es-ES"/>
         </w:rPr>
-        <w:t>i</w:t>
-      </w:r>
-      <w:r>
-        <w:rPr>
-          <w:b/>
-          <w:color w:val="D4D4D4"/>
-          <w:sz w:val="24"/>
-          <w:lang w:val="en-GB" w:eastAsia="es-ES"/>
-        </w:rPr>
-        <w:t>&lt;</w:t>
-      </w:r>
-      <w:proofErr w:type="spellStart"/>
-      <w:r>
-        <w:rPr>
-          <w:b/>
-          <w:color w:val="9CDCFE"/>
-          <w:sz w:val="24"/>
-          <w:lang w:val="en-GB" w:eastAsia="es-ES"/>
-        </w:rPr>
-        <w:t>n</w:t>
-      </w:r>
-      <w:r>
-        <w:rPr>
-          <w:b/>
-          <w:sz w:val="24"/>
-          <w:lang w:val="en-GB" w:eastAsia="es-ES"/>
-        </w:rPr>
-        <w:t>;</w:t>
-      </w:r>
-      <w:r>
-        <w:rPr>
-          <w:b/>
-          <w:color w:val="9CDCFE"/>
-          <w:sz w:val="24"/>
-          <w:lang w:val="en-GB" w:eastAsia="es-ES"/>
-        </w:rPr>
-        <w:t>i</w:t>
-      </w:r>
-      <w:proofErr w:type="spellEnd"/>
-      <w:r>
-        <w:rPr>
-          <w:b/>
-          <w:color w:val="D4D4D4"/>
-          <w:sz w:val="24"/>
-          <w:lang w:val="en-GB" w:eastAsia="es-ES"/>
-        </w:rPr>
-        <w:t>++</w:t>
-      </w:r>
-      <w:r>
-        <w:rPr>
-          <w:b/>
-          <w:sz w:val="24"/>
-          <w:lang w:val="en-GB" w:eastAsia="es-ES"/>
-        </w:rPr>
-        <w:t>){</w:t>
-      </w:r>
-    </w:p>
-    <w:p>
-      <w:pPr>
-        <w:pStyle w:val="Textoindependienteprimerasangra2"/>
-        <w:rPr>
-          <w:b/>
-          <w:sz w:val="24"/>
-          <w:lang w:val="en-GB" w:eastAsia="es-ES"/>
-        </w:rPr>
-      </w:pPr>
-      <w:proofErr w:type="gramStart"/>
-      <w:r>
-        <w:rPr>
-          <w:b/>
-          <w:color w:val="C586C0"/>
-          <w:sz w:val="24"/>
-          <w:lang w:val="en-GB" w:eastAsia="es-ES"/>
-        </w:rPr>
-        <w:t>for</w:t>
+        <w:t>j</w:t>
       </w:r>
       <w:proofErr w:type="gramEnd"/>
-      <w:r>
-        <w:rPr>
-          <w:b/>
-          <w:sz w:val="24"/>
-          <w:lang w:val="en-GB" w:eastAsia="es-ES"/>
-        </w:rPr>
-        <w:t xml:space="preserve"> (</w:t>
-      </w:r>
-      <w:proofErr w:type="spellStart"/>
-      <w:r>
-        <w:rPr>
-          <w:b/>
-          <w:color w:val="4EC9B0"/>
-          <w:sz w:val="24"/>
-          <w:lang w:val="en-GB" w:eastAsia="es-ES"/>
-        </w:rPr>
-        <w:t>int</w:t>
-      </w:r>
-      <w:proofErr w:type="spellEnd"/>
-      <w:r>
-        <w:rPr>
-          <w:b/>
-          <w:sz w:val="24"/>
-          <w:lang w:val="en-GB" w:eastAsia="es-ES"/>
-        </w:rPr>
-        <w:t xml:space="preserve"> </w:t>
-      </w:r>
-      <w:r>
-        <w:rPr>
-          <w:b/>
-          <w:color w:val="9CDCFE"/>
-          <w:sz w:val="24"/>
-          <w:lang w:val="en-GB" w:eastAsia="es-ES"/>
-        </w:rPr>
-        <w:t>j</w:t>
-      </w:r>
-      <w:r>
-        <w:rPr>
-          <w:b/>
-          <w:color w:val="D4D4D4"/>
-          <w:sz w:val="24"/>
-          <w:lang w:val="en-GB" w:eastAsia="es-ES"/>
-        </w:rPr>
-        <w:t>=</w:t>
-      </w:r>
-      <w:r>
-        <w:rPr>
-          <w:b/>
-          <w:color w:val="B5CEA8"/>
-          <w:sz w:val="24"/>
-          <w:lang w:val="en-GB" w:eastAsia="es-ES"/>
-        </w:rPr>
-        <w:t>0</w:t>
-      </w:r>
-      <w:r>
-        <w:rPr>
-          <w:b/>
-          <w:sz w:val="24"/>
-          <w:lang w:val="en-GB" w:eastAsia="es-ES"/>
-        </w:rPr>
-        <w:t>;</w:t>
-      </w:r>
-      <w:r>
-        <w:rPr>
-          <w:b/>
-          <w:color w:val="9CDCFE"/>
-          <w:sz w:val="24"/>
-          <w:lang w:val="en-GB" w:eastAsia="es-ES"/>
-        </w:rPr>
-        <w:t>j</w:t>
-      </w:r>
       <w:r>
         <w:rPr>
           <w:b/>
@@ -15742,39 +15742,53 @@
         </w:rPr>
       </w:pPr>
       <w:proofErr w:type="spellStart"/>
+      <w:r>
+        <w:rPr>
+          <w:color w:val="9CDCFE"/>
+          <w:sz w:val="24"/>
+          <w:lang w:val="en-GB" w:eastAsia="es-ES"/>
+        </w:rPr>
+        <w:t>cont</w:t>
+      </w:r>
+      <w:proofErr w:type="spellEnd"/>
+      <w:r>
+        <w:rPr>
+          <w:color w:val="D4D4D4"/>
+          <w:sz w:val="24"/>
+          <w:lang w:val="en-GB" w:eastAsia="es-ES"/>
+        </w:rPr>
+        <w:t>++</w:t>
+      </w:r>
+      <w:r>
+        <w:rPr>
+          <w:color w:val="CCCCCC"/>
+          <w:sz w:val="24"/>
+          <w:lang w:val="en-GB" w:eastAsia="es-ES"/>
+        </w:rPr>
+        <w:t xml:space="preserve">;   </w:t>
+      </w:r>
+      <w:r>
+        <w:rPr>
+          <w:sz w:val="24"/>
+          <w:lang w:val="en-GB" w:eastAsia="es-ES"/>
+        </w:rPr>
+        <w:t xml:space="preserve">// </w:t>
+      </w:r>
       <w:proofErr w:type="gramStart"/>
       <w:r>
         <w:rPr>
-          <w:color w:val="9CDCFE"/>
           <w:sz w:val="24"/>
           <w:lang w:val="en-GB" w:eastAsia="es-ES"/>
         </w:rPr>
-        <w:t>cont</w:t>
-      </w:r>
-      <w:proofErr w:type="spellEnd"/>
+        <w:t>O(</w:t>
+      </w:r>
       <w:proofErr w:type="gramEnd"/>
       <w:r>
         <w:rPr>
-          <w:color w:val="D4D4D4"/>
           <w:sz w:val="24"/>
           <w:lang w:val="en-GB" w:eastAsia="es-ES"/>
         </w:rPr>
-        <w:t>++</w:t>
-      </w:r>
-      <w:r>
-        <w:rPr>
-          <w:color w:val="CCCCCC"/>
-          <w:sz w:val="24"/>
-          <w:lang w:val="en-GB" w:eastAsia="es-ES"/>
-        </w:rPr>
-        <w:t xml:space="preserve">;   </w:t>
-      </w:r>
-      <w:r>
-        <w:rPr>
-          <w:sz w:val="24"/>
-          <w:lang w:val="en-GB" w:eastAsia="es-ES"/>
-        </w:rPr>
-        <w:t>// O(1)    </w:t>
+        <w:t>1)    </w:t>
       </w:r>
     </w:p>
     <w:p>
@@ -17265,81 +17279,81 @@
           <w:lang w:val="en-GB" w:eastAsia="es-ES"/>
         </w:rPr>
       </w:pPr>
+      <w:r>
+        <w:rPr>
+          <w:b/>
+          <w:color w:val="C586C0"/>
+          <w:sz w:val="24"/>
+          <w:lang w:val="en-GB" w:eastAsia="es-ES"/>
+        </w:rPr>
+        <w:t>for</w:t>
+      </w:r>
+      <w:r>
+        <w:rPr>
+          <w:b/>
+          <w:sz w:val="24"/>
+          <w:lang w:val="en-GB" w:eastAsia="es-ES"/>
+        </w:rPr>
+        <w:t xml:space="preserve"> (</w:t>
+      </w:r>
+      <w:proofErr w:type="spellStart"/>
+      <w:r>
+        <w:rPr>
+          <w:b/>
+          <w:color w:val="4EC9B0"/>
+          <w:sz w:val="24"/>
+          <w:lang w:val="en-GB" w:eastAsia="es-ES"/>
+        </w:rPr>
+        <w:t>int</w:t>
+      </w:r>
+      <w:proofErr w:type="spellEnd"/>
+      <w:r>
+        <w:rPr>
+          <w:b/>
+          <w:sz w:val="24"/>
+          <w:lang w:val="en-GB" w:eastAsia="es-ES"/>
+        </w:rPr>
+        <w:t xml:space="preserve"> </w:t>
+      </w:r>
+      <w:proofErr w:type="spellStart"/>
+      <w:r>
+        <w:rPr>
+          <w:b/>
+          <w:color w:val="9CDCFE"/>
+          <w:sz w:val="24"/>
+          <w:lang w:val="en-GB" w:eastAsia="es-ES"/>
+        </w:rPr>
+        <w:t>i</w:t>
+      </w:r>
+      <w:proofErr w:type="spellEnd"/>
+      <w:r>
+        <w:rPr>
+          <w:b/>
+          <w:color w:val="D4D4D4"/>
+          <w:sz w:val="24"/>
+          <w:lang w:val="en-GB" w:eastAsia="es-ES"/>
+        </w:rPr>
+        <w:t>=</w:t>
+      </w:r>
       <w:proofErr w:type="gramStart"/>
       <w:r>
         <w:rPr>
           <w:b/>
-          <w:color w:val="C586C0"/>
+          <w:color w:val="B5CEA8"/>
           <w:sz w:val="24"/>
           <w:lang w:val="en-GB" w:eastAsia="es-ES"/>
         </w:rPr>
-        <w:t>for</w:t>
+        <w:t>1</w:t>
+      </w:r>
+      <w:r>
+        <w:rPr>
+          <w:b/>
+          <w:sz w:val="24"/>
+          <w:lang w:val="en-GB" w:eastAsia="es-ES"/>
+        </w:rPr>
+        <w:t>;i</w:t>
       </w:r>
       <w:proofErr w:type="gramEnd"/>
-      <w:r>
-        <w:rPr>
-          <w:b/>
-          <w:sz w:val="24"/>
-          <w:lang w:val="en-GB" w:eastAsia="es-ES"/>
-        </w:rPr>
-        <w:t xml:space="preserve"> (</w:t>
-      </w:r>
-      <w:proofErr w:type="spellStart"/>
-      <w:r>
-        <w:rPr>
-          <w:b/>
-          <w:color w:val="4EC9B0"/>
-          <w:sz w:val="24"/>
-          <w:lang w:val="en-GB" w:eastAsia="es-ES"/>
-        </w:rPr>
-        <w:t>int</w:t>
-      </w:r>
-      <w:proofErr w:type="spellEnd"/>
-      <w:r>
-        <w:rPr>
-          <w:b/>
-          <w:sz w:val="24"/>
-          <w:lang w:val="en-GB" w:eastAsia="es-ES"/>
-        </w:rPr>
-        <w:t xml:space="preserve"> </w:t>
-      </w:r>
-      <w:proofErr w:type="spellStart"/>
-      <w:r>
-        <w:rPr>
-          <w:b/>
-          <w:color w:val="9CDCFE"/>
-          <w:sz w:val="24"/>
-          <w:lang w:val="en-GB" w:eastAsia="es-ES"/>
-        </w:rPr>
-        <w:t>i</w:t>
-      </w:r>
-      <w:proofErr w:type="spellEnd"/>
-      <w:r>
-        <w:rPr>
-          <w:b/>
-          <w:color w:val="D4D4D4"/>
-          <w:sz w:val="24"/>
-          <w:lang w:val="en-GB" w:eastAsia="es-ES"/>
-        </w:rPr>
-        <w:t>=</w:t>
-      </w:r>
-      <w:r>
-        <w:rPr>
-          <w:b/>
-          <w:color w:val="B5CEA8"/>
-          <w:sz w:val="24"/>
-          <w:lang w:val="en-GB" w:eastAsia="es-ES"/>
-        </w:rPr>
-        <w:t>1</w:t>
-      </w:r>
-      <w:r>
-        <w:rPr>
-          <w:b/>
-          <w:sz w:val="24"/>
-          <w:lang w:val="en-GB" w:eastAsia="es-ES"/>
-        </w:rPr>
-        <w:t>;i</w:t>
-      </w:r>
       <w:r>
         <w:rPr>
           <w:b/>
@@ -17418,81 +17432,81 @@
           <w:lang w:val="en-GB" w:eastAsia="es-ES"/>
         </w:rPr>
       </w:pPr>
+      <w:r>
+        <w:rPr>
+          <w:b/>
+          <w:color w:val="C586C0"/>
+          <w:sz w:val="24"/>
+          <w:lang w:val="en-GB" w:eastAsia="es-ES"/>
+        </w:rPr>
+        <w:t>for</w:t>
+      </w:r>
+      <w:r>
+        <w:rPr>
+          <w:b/>
+          <w:sz w:val="24"/>
+          <w:lang w:val="en-GB" w:eastAsia="es-ES"/>
+        </w:rPr>
+        <w:t xml:space="preserve"> (</w:t>
+      </w:r>
+      <w:proofErr w:type="spellStart"/>
+      <w:r>
+        <w:rPr>
+          <w:b/>
+          <w:color w:val="4EC9B0"/>
+          <w:sz w:val="24"/>
+          <w:lang w:val="en-GB" w:eastAsia="es-ES"/>
+        </w:rPr>
+        <w:t>int</w:t>
+      </w:r>
+      <w:proofErr w:type="spellEnd"/>
+      <w:r>
+        <w:rPr>
+          <w:b/>
+          <w:sz w:val="24"/>
+          <w:lang w:val="en-GB" w:eastAsia="es-ES"/>
+        </w:rPr>
+        <w:t xml:space="preserve"> </w:t>
+      </w:r>
+      <w:proofErr w:type="spellStart"/>
+      <w:r>
+        <w:rPr>
+          <w:b/>
+          <w:color w:val="9CDCFE"/>
+          <w:sz w:val="24"/>
+          <w:lang w:val="en-GB" w:eastAsia="es-ES"/>
+        </w:rPr>
+        <w:t>i</w:t>
+      </w:r>
+      <w:proofErr w:type="spellEnd"/>
+      <w:r>
+        <w:rPr>
+          <w:b/>
+          <w:color w:val="D4D4D4"/>
+          <w:sz w:val="24"/>
+          <w:lang w:val="en-GB" w:eastAsia="es-ES"/>
+        </w:rPr>
+        <w:t>=</w:t>
+      </w:r>
       <w:proofErr w:type="gramStart"/>
       <w:r>
         <w:rPr>
           <w:b/>
-          <w:color w:val="C586C0"/>
+          <w:color w:val="B5CEA8"/>
           <w:sz w:val="24"/>
           <w:lang w:val="en-GB" w:eastAsia="es-ES"/>
         </w:rPr>
-        <w:t>for</w:t>
+        <w:t>1</w:t>
+      </w:r>
+      <w:r>
+        <w:rPr>
+          <w:b/>
+          <w:sz w:val="24"/>
+          <w:lang w:val="en-GB" w:eastAsia="es-ES"/>
+        </w:rPr>
+        <w:t>;i</w:t>
       </w:r>
       <w:proofErr w:type="gramEnd"/>
-      <w:r>
-        <w:rPr>
-          <w:b/>
-          <w:sz w:val="24"/>
-          <w:lang w:val="en-GB" w:eastAsia="es-ES"/>
-        </w:rPr>
-        <w:t xml:space="preserve"> (</w:t>
-      </w:r>
-      <w:proofErr w:type="spellStart"/>
-      <w:r>
-        <w:rPr>
-          <w:b/>
-          <w:color w:val="4EC9B0"/>
-          <w:sz w:val="24"/>
-          <w:lang w:val="en-GB" w:eastAsia="es-ES"/>
-        </w:rPr>
-        <w:t>int</w:t>
-      </w:r>
-      <w:proofErr w:type="spellEnd"/>
-      <w:r>
-        <w:rPr>
-          <w:b/>
-          <w:sz w:val="24"/>
-          <w:lang w:val="en-GB" w:eastAsia="es-ES"/>
-        </w:rPr>
-        <w:t xml:space="preserve"> </w:t>
-      </w:r>
-      <w:proofErr w:type="spellStart"/>
-      <w:r>
-        <w:rPr>
-          <w:b/>
-          <w:color w:val="9CDCFE"/>
-          <w:sz w:val="24"/>
-          <w:lang w:val="en-GB" w:eastAsia="es-ES"/>
-        </w:rPr>
-        <w:t>i</w:t>
-      </w:r>
-      <w:proofErr w:type="spellEnd"/>
-      <w:r>
-        <w:rPr>
-          <w:b/>
-          <w:color w:val="D4D4D4"/>
-          <w:sz w:val="24"/>
-          <w:lang w:val="en-GB" w:eastAsia="es-ES"/>
-        </w:rPr>
-        <w:t>=</w:t>
-      </w:r>
-      <w:r>
-        <w:rPr>
-          <w:b/>
-          <w:color w:val="B5CEA8"/>
-          <w:sz w:val="24"/>
-          <w:lang w:val="en-GB" w:eastAsia="es-ES"/>
-        </w:rPr>
-        <w:t>1</w:t>
-      </w:r>
-      <w:r>
-        <w:rPr>
-          <w:b/>
-          <w:sz w:val="24"/>
-          <w:lang w:val="en-GB" w:eastAsia="es-ES"/>
-        </w:rPr>
-        <w:t>;i</w:t>
-      </w:r>
       <w:r>
         <w:rPr>
           <w:b/>
@@ -27454,17 +27468,1076 @@
           <w:szCs w:val="40"/>
         </w:rPr>
         <w:lastRenderedPageBreak/>
-        <w:t>P</w:t>
-      </w:r>
-      <w:r>
-        <w:rPr>
-          <w:b/>
-          <w:color w:val="4472C4" w:themeColor="accent5"/>
-          <w:sz w:val="40"/>
-          <w:szCs w:val="40"/>
-        </w:rPr>
-        <w:t>7</w:t>
-      </w:r>
+        <w:t>P7</w:t>
+      </w:r>
+    </w:p>
+    <w:p>
+      <w:pPr>
+        <w:pStyle w:val="Textoindependiente"/>
+        <w:rPr>
+          <w:b/>
+          <w:sz w:val="24"/>
+          <w:szCs w:val="24"/>
+        </w:rPr>
+      </w:pPr>
+      <w:r>
+        <w:rPr>
+          <w:b/>
+          <w:sz w:val="24"/>
+          <w:szCs w:val="24"/>
+        </w:rPr>
+        <w:t>Tabla de ejecuciones para comparar con el algoritmo sin poda</w:t>
+      </w:r>
+    </w:p>
+    <w:tbl>
+      <w:tblPr>
+        <w:tblStyle w:val="Tablaconcuadrcula"/>
+        <w:tblW w:w="0" w:type="auto"/>
+        <w:tblLook w:val="04A0" w:firstRow="1" w:lastRow="0" w:firstColumn="1" w:lastColumn="0" w:noHBand="0" w:noVBand="1"/>
+      </w:tblPr>
+      <w:tblGrid>
+        <w:gridCol w:w="2427"/>
+        <w:gridCol w:w="2315"/>
+        <w:gridCol w:w="1876"/>
+        <w:gridCol w:w="1876"/>
+      </w:tblGrid>
+      <w:tr>
+        <w:tc>
+          <w:tcPr>
+            <w:tcW w:w="2427" w:type="dxa"/>
+          </w:tcPr>
+          <w:p>
+            <w:pPr>
+              <w:pStyle w:val="Textoindependiente"/>
+              <w:jc w:val="center"/>
+              <w:rPr>
+                <w:b/>
+                <w:sz w:val="24"/>
+                <w:szCs w:val="24"/>
+              </w:rPr>
+            </w:pPr>
+            <w:r>
+              <w:rPr>
+                <w:b/>
+                <w:sz w:val="24"/>
+                <w:szCs w:val="24"/>
+              </w:rPr>
+              <w:t>fichero</w:t>
+            </w:r>
+          </w:p>
+        </w:tc>
+        <w:tc>
+          <w:tcPr>
+            <w:tcW w:w="2315" w:type="dxa"/>
+          </w:tcPr>
+          <w:p>
+            <w:pPr>
+              <w:pStyle w:val="Textoindependiente"/>
+              <w:jc w:val="center"/>
+              <w:rPr>
+                <w:b/>
+                <w:sz w:val="24"/>
+                <w:szCs w:val="24"/>
+              </w:rPr>
+            </w:pPr>
+            <w:r>
+              <w:rPr>
+                <w:b/>
+                <w:sz w:val="24"/>
+                <w:szCs w:val="24"/>
+              </w:rPr>
+              <w:t>Tiempo (ms)</w:t>
+            </w:r>
+          </w:p>
+        </w:tc>
+        <w:tc>
+          <w:tcPr>
+            <w:tcW w:w="1876" w:type="dxa"/>
+          </w:tcPr>
+          <w:p>
+            <w:pPr>
+              <w:pStyle w:val="Textoindependiente"/>
+              <w:jc w:val="center"/>
+              <w:rPr>
+                <w:b/>
+                <w:sz w:val="24"/>
+                <w:szCs w:val="24"/>
+              </w:rPr>
+            </w:pPr>
+            <w:r>
+              <w:rPr>
+                <w:b/>
+                <w:sz w:val="24"/>
+                <w:szCs w:val="24"/>
+              </w:rPr>
+              <w:t>Contenedores</w:t>
+            </w:r>
+          </w:p>
+        </w:tc>
+        <w:tc>
+          <w:tcPr>
+            <w:tcW w:w="1876" w:type="dxa"/>
+          </w:tcPr>
+          <w:p>
+            <w:pPr>
+              <w:pStyle w:val="Textoindependiente"/>
+              <w:jc w:val="center"/>
+              <w:rPr>
+                <w:b/>
+                <w:sz w:val="24"/>
+                <w:szCs w:val="24"/>
+              </w:rPr>
+            </w:pPr>
+            <w:r>
+              <w:rPr>
+                <w:b/>
+                <w:sz w:val="24"/>
+                <w:szCs w:val="24"/>
+              </w:rPr>
+              <w:t>Llamadas R</w:t>
+            </w:r>
+          </w:p>
+        </w:tc>
+      </w:tr>
+      <w:tr>
+        <w:tc>
+          <w:tcPr>
+            <w:tcW w:w="2427" w:type="dxa"/>
+          </w:tcPr>
+          <w:p>
+            <w:pPr>
+              <w:pStyle w:val="Textoindependiente"/>
+              <w:jc w:val="center"/>
+              <w:rPr>
+                <w:sz w:val="24"/>
+                <w:szCs w:val="24"/>
+                <w:u w:val="single"/>
+              </w:rPr>
+            </w:pPr>
+            <w:r>
+              <w:rPr>
+                <w:sz w:val="24"/>
+                <w:szCs w:val="24"/>
+                <w:u w:val="single"/>
+              </w:rPr>
+              <w:t>test00.txt</w:t>
+            </w:r>
+          </w:p>
+        </w:tc>
+        <w:tc>
+          <w:tcPr>
+            <w:tcW w:w="2315" w:type="dxa"/>
+          </w:tcPr>
+          <w:p>
+            <w:pPr>
+              <w:pStyle w:val="Textoindependiente"/>
+              <w:jc w:val="center"/>
+              <w:rPr>
+                <w:sz w:val="24"/>
+                <w:szCs w:val="24"/>
+              </w:rPr>
+            </w:pPr>
+            <w:r>
+              <w:rPr>
+                <w:sz w:val="24"/>
+                <w:szCs w:val="24"/>
+              </w:rPr>
+              <w:t>3</w:t>
+            </w:r>
+          </w:p>
+        </w:tc>
+        <w:tc>
+          <w:tcPr>
+            <w:tcW w:w="1876" w:type="dxa"/>
+          </w:tcPr>
+          <w:p>
+            <w:pPr>
+              <w:pStyle w:val="Textoindependiente"/>
+              <w:jc w:val="center"/>
+              <w:rPr>
+                <w:color w:val="FF0000"/>
+                <w:sz w:val="24"/>
+                <w:szCs w:val="24"/>
+              </w:rPr>
+            </w:pPr>
+            <w:r>
+              <w:rPr>
+                <w:color w:val="FF0000"/>
+                <w:sz w:val="24"/>
+                <w:szCs w:val="24"/>
+              </w:rPr>
+              <w:t>5</w:t>
+            </w:r>
+          </w:p>
+        </w:tc>
+        <w:tc>
+          <w:tcPr>
+            <w:tcW w:w="1876" w:type="dxa"/>
+          </w:tcPr>
+          <w:p>
+            <w:pPr>
+              <w:pStyle w:val="Textoindependiente"/>
+              <w:jc w:val="center"/>
+              <w:rPr>
+                <w:sz w:val="24"/>
+                <w:szCs w:val="24"/>
+              </w:rPr>
+            </w:pPr>
+            <w:r>
+              <w:rPr>
+                <w:sz w:val="24"/>
+                <w:szCs w:val="24"/>
+              </w:rPr>
+              <w:t>3</w:t>
+            </w:r>
+          </w:p>
+        </w:tc>
+      </w:tr>
+      <w:tr>
+        <w:tc>
+          <w:tcPr>
+            <w:tcW w:w="2427" w:type="dxa"/>
+          </w:tcPr>
+          <w:p>
+            <w:pPr>
+              <w:pStyle w:val="Textoindependiente"/>
+              <w:jc w:val="center"/>
+              <w:rPr>
+                <w:sz w:val="24"/>
+                <w:szCs w:val="24"/>
+                <w:u w:val="single"/>
+              </w:rPr>
+            </w:pPr>
+            <w:r>
+              <w:rPr>
+                <w:sz w:val="24"/>
+                <w:szCs w:val="24"/>
+                <w:u w:val="single"/>
+              </w:rPr>
+              <w:t>test01.txt</w:t>
+            </w:r>
+          </w:p>
+        </w:tc>
+        <w:tc>
+          <w:tcPr>
+            <w:tcW w:w="2315" w:type="dxa"/>
+          </w:tcPr>
+          <w:p>
+            <w:pPr>
+              <w:pStyle w:val="Textoindependiente"/>
+              <w:jc w:val="center"/>
+              <w:rPr>
+                <w:sz w:val="24"/>
+                <w:szCs w:val="24"/>
+              </w:rPr>
+            </w:pPr>
+            <w:r>
+              <w:rPr>
+                <w:sz w:val="24"/>
+                <w:szCs w:val="24"/>
+              </w:rPr>
+              <w:t>2</w:t>
+            </w:r>
+          </w:p>
+        </w:tc>
+        <w:tc>
+          <w:tcPr>
+            <w:tcW w:w="1876" w:type="dxa"/>
+          </w:tcPr>
+          <w:p>
+            <w:pPr>
+              <w:pStyle w:val="Textoindependiente"/>
+              <w:jc w:val="center"/>
+              <w:rPr>
+                <w:sz w:val="24"/>
+                <w:szCs w:val="24"/>
+              </w:rPr>
+            </w:pPr>
+            <w:r>
+              <w:rPr>
+                <w:sz w:val="24"/>
+                <w:szCs w:val="24"/>
+              </w:rPr>
+              <w:t>5</w:t>
+            </w:r>
+          </w:p>
+        </w:tc>
+        <w:tc>
+          <w:tcPr>
+            <w:tcW w:w="1876" w:type="dxa"/>
+          </w:tcPr>
+          <w:p>
+            <w:pPr>
+              <w:pStyle w:val="Textoindependiente"/>
+              <w:jc w:val="center"/>
+              <w:rPr>
+                <w:sz w:val="24"/>
+                <w:szCs w:val="24"/>
+              </w:rPr>
+            </w:pPr>
+            <w:r>
+              <w:rPr>
+                <w:sz w:val="24"/>
+                <w:szCs w:val="24"/>
+              </w:rPr>
+              <w:t>10</w:t>
+            </w:r>
+          </w:p>
+        </w:tc>
+      </w:tr>
+      <w:tr>
+        <w:tc>
+          <w:tcPr>
+            <w:tcW w:w="2427" w:type="dxa"/>
+          </w:tcPr>
+          <w:p>
+            <w:pPr>
+              <w:pStyle w:val="Textoindependiente"/>
+              <w:jc w:val="center"/>
+              <w:rPr>
+                <w:sz w:val="24"/>
+                <w:szCs w:val="24"/>
+                <w:u w:val="single"/>
+              </w:rPr>
+            </w:pPr>
+            <w:r>
+              <w:rPr>
+                <w:sz w:val="24"/>
+                <w:szCs w:val="24"/>
+                <w:u w:val="single"/>
+              </w:rPr>
+              <w:t>test02.txt</w:t>
+            </w:r>
+          </w:p>
+        </w:tc>
+        <w:tc>
+          <w:tcPr>
+            <w:tcW w:w="2315" w:type="dxa"/>
+          </w:tcPr>
+          <w:p>
+            <w:pPr>
+              <w:pStyle w:val="Textoindependiente"/>
+              <w:jc w:val="center"/>
+              <w:rPr>
+                <w:sz w:val="24"/>
+                <w:szCs w:val="24"/>
+              </w:rPr>
+            </w:pPr>
+            <w:r>
+              <w:rPr>
+                <w:sz w:val="24"/>
+                <w:szCs w:val="24"/>
+              </w:rPr>
+              <w:t>6</w:t>
+            </w:r>
+          </w:p>
+        </w:tc>
+        <w:tc>
+          <w:tcPr>
+            <w:tcW w:w="1876" w:type="dxa"/>
+          </w:tcPr>
+          <w:p>
+            <w:pPr>
+              <w:pStyle w:val="Textoindependiente"/>
+              <w:jc w:val="center"/>
+              <w:rPr>
+                <w:sz w:val="24"/>
+                <w:szCs w:val="24"/>
+              </w:rPr>
+            </w:pPr>
+            <w:r>
+              <w:rPr>
+                <w:sz w:val="24"/>
+                <w:szCs w:val="24"/>
+              </w:rPr>
+              <w:t>7</w:t>
+            </w:r>
+          </w:p>
+        </w:tc>
+        <w:tc>
+          <w:tcPr>
+            <w:tcW w:w="1876" w:type="dxa"/>
+          </w:tcPr>
+          <w:p>
+            <w:pPr>
+              <w:pStyle w:val="Textoindependiente"/>
+              <w:jc w:val="center"/>
+              <w:rPr>
+                <w:sz w:val="24"/>
+                <w:szCs w:val="24"/>
+              </w:rPr>
+            </w:pPr>
+            <w:r>
+              <w:rPr>
+                <w:sz w:val="24"/>
+                <w:szCs w:val="24"/>
+              </w:rPr>
+              <w:t>16</w:t>
+            </w:r>
+          </w:p>
+        </w:tc>
+      </w:tr>
+      <w:tr>
+        <w:tc>
+          <w:tcPr>
+            <w:tcW w:w="2427" w:type="dxa"/>
+          </w:tcPr>
+          <w:p>
+            <w:pPr>
+              <w:pStyle w:val="Textoindependiente"/>
+              <w:jc w:val="center"/>
+              <w:rPr>
+                <w:sz w:val="24"/>
+                <w:szCs w:val="24"/>
+                <w:u w:val="single"/>
+              </w:rPr>
+            </w:pPr>
+            <w:r>
+              <w:rPr>
+                <w:sz w:val="24"/>
+                <w:szCs w:val="24"/>
+                <w:u w:val="single"/>
+              </w:rPr>
+              <w:t>test03.txt</w:t>
+            </w:r>
+          </w:p>
+        </w:tc>
+        <w:tc>
+          <w:tcPr>
+            <w:tcW w:w="2315" w:type="dxa"/>
+          </w:tcPr>
+          <w:p>
+            <w:pPr>
+              <w:pStyle w:val="Textoindependiente"/>
+              <w:jc w:val="center"/>
+              <w:rPr>
+                <w:sz w:val="24"/>
+                <w:szCs w:val="24"/>
+              </w:rPr>
+            </w:pPr>
+            <w:r>
+              <w:rPr>
+                <w:sz w:val="24"/>
+                <w:szCs w:val="24"/>
+              </w:rPr>
+              <w:t>2</w:t>
+            </w:r>
+          </w:p>
+        </w:tc>
+        <w:tc>
+          <w:tcPr>
+            <w:tcW w:w="1876" w:type="dxa"/>
+          </w:tcPr>
+          <w:p>
+            <w:pPr>
+              <w:pStyle w:val="Textoindependiente"/>
+              <w:jc w:val="center"/>
+              <w:rPr>
+                <w:sz w:val="24"/>
+                <w:szCs w:val="24"/>
+              </w:rPr>
+            </w:pPr>
+            <w:r>
+              <w:rPr>
+                <w:sz w:val="24"/>
+                <w:szCs w:val="24"/>
+              </w:rPr>
+              <w:t>6</w:t>
+            </w:r>
+          </w:p>
+        </w:tc>
+        <w:tc>
+          <w:tcPr>
+            <w:tcW w:w="1876" w:type="dxa"/>
+          </w:tcPr>
+          <w:p>
+            <w:pPr>
+              <w:pStyle w:val="Textoindependiente"/>
+              <w:jc w:val="center"/>
+              <w:rPr>
+                <w:sz w:val="24"/>
+                <w:szCs w:val="24"/>
+              </w:rPr>
+            </w:pPr>
+            <w:r>
+              <w:rPr>
+                <w:sz w:val="24"/>
+                <w:szCs w:val="24"/>
+              </w:rPr>
+              <w:t>13</w:t>
+            </w:r>
+          </w:p>
+        </w:tc>
+      </w:tr>
+      <w:tr>
+        <w:tc>
+          <w:tcPr>
+            <w:tcW w:w="2427" w:type="dxa"/>
+          </w:tcPr>
+          <w:p>
+            <w:pPr>
+              <w:pStyle w:val="Textoindependiente"/>
+              <w:jc w:val="center"/>
+              <w:rPr>
+                <w:sz w:val="24"/>
+                <w:szCs w:val="24"/>
+                <w:u w:val="single"/>
+              </w:rPr>
+            </w:pPr>
+            <w:r>
+              <w:rPr>
+                <w:sz w:val="24"/>
+                <w:szCs w:val="24"/>
+                <w:u w:val="single"/>
+              </w:rPr>
+              <w:t>test04.txt</w:t>
+            </w:r>
+          </w:p>
+        </w:tc>
+        <w:tc>
+          <w:tcPr>
+            <w:tcW w:w="2315" w:type="dxa"/>
+          </w:tcPr>
+          <w:p>
+            <w:pPr>
+              <w:pStyle w:val="Textoindependiente"/>
+              <w:jc w:val="center"/>
+              <w:rPr>
+                <w:sz w:val="24"/>
+                <w:szCs w:val="24"/>
+              </w:rPr>
+            </w:pPr>
+            <w:r>
+              <w:rPr>
+                <w:sz w:val="24"/>
+                <w:szCs w:val="24"/>
+              </w:rPr>
+              <w:t>1</w:t>
+            </w:r>
+          </w:p>
+        </w:tc>
+        <w:tc>
+          <w:tcPr>
+            <w:tcW w:w="1876" w:type="dxa"/>
+          </w:tcPr>
+          <w:p>
+            <w:pPr>
+              <w:pStyle w:val="Textoindependiente"/>
+              <w:jc w:val="center"/>
+              <w:rPr>
+                <w:sz w:val="24"/>
+                <w:szCs w:val="24"/>
+              </w:rPr>
+            </w:pPr>
+            <w:r>
+              <w:rPr>
+                <w:sz w:val="24"/>
+                <w:szCs w:val="24"/>
+              </w:rPr>
+              <w:t>10</w:t>
+            </w:r>
+          </w:p>
+        </w:tc>
+        <w:tc>
+          <w:tcPr>
+            <w:tcW w:w="1876" w:type="dxa"/>
+          </w:tcPr>
+          <w:p>
+            <w:pPr>
+              <w:pStyle w:val="Textoindependiente"/>
+              <w:jc w:val="center"/>
+              <w:rPr>
+                <w:sz w:val="24"/>
+                <w:szCs w:val="24"/>
+              </w:rPr>
+            </w:pPr>
+            <w:r>
+              <w:rPr>
+                <w:sz w:val="24"/>
+                <w:szCs w:val="24"/>
+              </w:rPr>
+              <w:t>21</w:t>
+            </w:r>
+          </w:p>
+        </w:tc>
+      </w:tr>
+      <w:tr>
+        <w:tc>
+          <w:tcPr>
+            <w:tcW w:w="2427" w:type="dxa"/>
+          </w:tcPr>
+          <w:p>
+            <w:pPr>
+              <w:pStyle w:val="Textoindependiente"/>
+              <w:jc w:val="center"/>
+              <w:rPr>
+                <w:sz w:val="24"/>
+                <w:szCs w:val="24"/>
+                <w:u w:val="single"/>
+              </w:rPr>
+            </w:pPr>
+            <w:r>
+              <w:rPr>
+                <w:sz w:val="24"/>
+                <w:szCs w:val="24"/>
+                <w:u w:val="single"/>
+              </w:rPr>
+              <w:t>test05.txt</w:t>
+            </w:r>
+          </w:p>
+        </w:tc>
+        <w:tc>
+          <w:tcPr>
+            <w:tcW w:w="2315" w:type="dxa"/>
+          </w:tcPr>
+          <w:p>
+            <w:pPr>
+              <w:pStyle w:val="Textoindependiente"/>
+              <w:jc w:val="center"/>
+              <w:rPr>
+                <w:sz w:val="24"/>
+                <w:szCs w:val="24"/>
+              </w:rPr>
+            </w:pPr>
+            <w:r>
+              <w:rPr>
+                <w:sz w:val="24"/>
+                <w:szCs w:val="24"/>
+              </w:rPr>
+              <w:t>5</w:t>
+            </w:r>
+          </w:p>
+        </w:tc>
+        <w:tc>
+          <w:tcPr>
+            <w:tcW w:w="1876" w:type="dxa"/>
+          </w:tcPr>
+          <w:p>
+            <w:pPr>
+              <w:pStyle w:val="Textoindependiente"/>
+              <w:jc w:val="center"/>
+              <w:rPr>
+                <w:sz w:val="24"/>
+                <w:szCs w:val="24"/>
+              </w:rPr>
+            </w:pPr>
+            <w:r>
+              <w:rPr>
+                <w:sz w:val="24"/>
+                <w:szCs w:val="24"/>
+              </w:rPr>
+              <w:t>14</w:t>
+            </w:r>
+          </w:p>
+        </w:tc>
+        <w:tc>
+          <w:tcPr>
+            <w:tcW w:w="1876" w:type="dxa"/>
+          </w:tcPr>
+          <w:p>
+            <w:pPr>
+              <w:pStyle w:val="Textoindependiente"/>
+              <w:jc w:val="center"/>
+              <w:rPr>
+                <w:sz w:val="24"/>
+                <w:szCs w:val="24"/>
+              </w:rPr>
+            </w:pPr>
+            <w:r>
+              <w:rPr>
+                <w:sz w:val="24"/>
+                <w:szCs w:val="24"/>
+              </w:rPr>
+              <w:t>27</w:t>
+            </w:r>
+          </w:p>
+        </w:tc>
+      </w:tr>
+      <w:tr>
+        <w:tc>
+          <w:tcPr>
+            <w:tcW w:w="2427" w:type="dxa"/>
+          </w:tcPr>
+          <w:p>
+            <w:pPr>
+              <w:pStyle w:val="Textoindependiente"/>
+              <w:jc w:val="center"/>
+              <w:rPr>
+                <w:sz w:val="24"/>
+                <w:szCs w:val="24"/>
+                <w:u w:val="single"/>
+              </w:rPr>
+            </w:pPr>
+            <w:r>
+              <w:rPr>
+                <w:sz w:val="24"/>
+                <w:szCs w:val="24"/>
+                <w:u w:val="single"/>
+              </w:rPr>
+              <w:t>test06.txt</w:t>
+            </w:r>
+          </w:p>
+        </w:tc>
+        <w:tc>
+          <w:tcPr>
+            <w:tcW w:w="2315" w:type="dxa"/>
+          </w:tcPr>
+          <w:p>
+            <w:pPr>
+              <w:pStyle w:val="Textoindependiente"/>
+              <w:jc w:val="center"/>
+              <w:rPr>
+                <w:sz w:val="24"/>
+                <w:szCs w:val="24"/>
+              </w:rPr>
+            </w:pPr>
+            <w:r>
+              <w:rPr>
+                <w:sz w:val="24"/>
+                <w:szCs w:val="24"/>
+              </w:rPr>
+              <w:t>1</w:t>
+            </w:r>
+          </w:p>
+        </w:tc>
+        <w:tc>
+          <w:tcPr>
+            <w:tcW w:w="1876" w:type="dxa"/>
+          </w:tcPr>
+          <w:p>
+            <w:pPr>
+              <w:pStyle w:val="Textoindependiente"/>
+              <w:jc w:val="center"/>
+              <w:rPr>
+                <w:sz w:val="24"/>
+                <w:szCs w:val="24"/>
+              </w:rPr>
+            </w:pPr>
+            <w:r>
+              <w:rPr>
+                <w:sz w:val="24"/>
+                <w:szCs w:val="24"/>
+              </w:rPr>
+              <w:t>7</w:t>
+            </w:r>
+          </w:p>
+        </w:tc>
+        <w:tc>
+          <w:tcPr>
+            <w:tcW w:w="1876" w:type="dxa"/>
+          </w:tcPr>
+          <w:p>
+            <w:pPr>
+              <w:pStyle w:val="Textoindependiente"/>
+              <w:jc w:val="center"/>
+              <w:rPr>
+                <w:sz w:val="24"/>
+                <w:szCs w:val="24"/>
+              </w:rPr>
+            </w:pPr>
+            <w:r>
+              <w:rPr>
+                <w:sz w:val="24"/>
+                <w:szCs w:val="24"/>
+              </w:rPr>
+              <w:t>15</w:t>
+            </w:r>
+          </w:p>
+        </w:tc>
+      </w:tr>
+      <w:tr>
+        <w:tc>
+          <w:tcPr>
+            <w:tcW w:w="2427" w:type="dxa"/>
+          </w:tcPr>
+          <w:p>
+            <w:pPr>
+              <w:pStyle w:val="Textoindependiente"/>
+              <w:jc w:val="center"/>
+              <w:rPr>
+                <w:sz w:val="24"/>
+                <w:szCs w:val="24"/>
+                <w:u w:val="single"/>
+              </w:rPr>
+            </w:pPr>
+            <w:r>
+              <w:rPr>
+                <w:sz w:val="24"/>
+                <w:szCs w:val="24"/>
+                <w:u w:val="single"/>
+              </w:rPr>
+              <w:t>test07.txt</w:t>
+            </w:r>
+          </w:p>
+        </w:tc>
+        <w:tc>
+          <w:tcPr>
+            <w:tcW w:w="2315" w:type="dxa"/>
+          </w:tcPr>
+          <w:p>
+            <w:pPr>
+              <w:pStyle w:val="Textoindependiente"/>
+              <w:jc w:val="center"/>
+              <w:rPr>
+                <w:sz w:val="24"/>
+                <w:szCs w:val="24"/>
+              </w:rPr>
+            </w:pPr>
+            <w:r>
+              <w:rPr>
+                <w:sz w:val="24"/>
+                <w:szCs w:val="24"/>
+              </w:rPr>
+              <w:t>2</w:t>
+            </w:r>
+          </w:p>
+        </w:tc>
+        <w:tc>
+          <w:tcPr>
+            <w:tcW w:w="1876" w:type="dxa"/>
+          </w:tcPr>
+          <w:p>
+            <w:pPr>
+              <w:pStyle w:val="Textoindependiente"/>
+              <w:jc w:val="center"/>
+              <w:rPr>
+                <w:sz w:val="24"/>
+                <w:szCs w:val="24"/>
+              </w:rPr>
+            </w:pPr>
+            <w:r>
+              <w:rPr>
+                <w:sz w:val="24"/>
+                <w:szCs w:val="24"/>
+              </w:rPr>
+              <w:t>8</w:t>
+            </w:r>
+          </w:p>
+        </w:tc>
+        <w:tc>
+          <w:tcPr>
+            <w:tcW w:w="1876" w:type="dxa"/>
+          </w:tcPr>
+          <w:p>
+            <w:pPr>
+              <w:pStyle w:val="Textoindependiente"/>
+              <w:jc w:val="center"/>
+              <w:rPr>
+                <w:sz w:val="24"/>
+                <w:szCs w:val="24"/>
+              </w:rPr>
+            </w:pPr>
+            <w:r>
+              <w:rPr>
+                <w:sz w:val="24"/>
+                <w:szCs w:val="24"/>
+              </w:rPr>
+              <w:t>16</w:t>
+            </w:r>
+          </w:p>
+        </w:tc>
+      </w:tr>
+      <w:tr>
+        <w:tc>
+          <w:tcPr>
+            <w:tcW w:w="2427" w:type="dxa"/>
+          </w:tcPr>
+          <w:p>
+            <w:pPr>
+              <w:pStyle w:val="Textoindependiente"/>
+              <w:jc w:val="center"/>
+              <w:rPr>
+                <w:sz w:val="24"/>
+                <w:szCs w:val="24"/>
+                <w:u w:val="single"/>
+              </w:rPr>
+            </w:pPr>
+            <w:r>
+              <w:rPr>
+                <w:sz w:val="24"/>
+                <w:szCs w:val="24"/>
+                <w:u w:val="single"/>
+              </w:rPr>
+              <w:t>test08.txt</w:t>
+            </w:r>
+          </w:p>
+        </w:tc>
+        <w:tc>
+          <w:tcPr>
+            <w:tcW w:w="2315" w:type="dxa"/>
+          </w:tcPr>
+          <w:p>
+            <w:pPr>
+              <w:pStyle w:val="Textoindependiente"/>
+              <w:jc w:val="center"/>
+              <w:rPr>
+                <w:sz w:val="24"/>
+                <w:szCs w:val="24"/>
+              </w:rPr>
+            </w:pPr>
+            <w:r>
+              <w:rPr>
+                <w:sz w:val="24"/>
+                <w:szCs w:val="24"/>
+              </w:rPr>
+              <w:t>9</w:t>
+            </w:r>
+          </w:p>
+        </w:tc>
+        <w:tc>
+          <w:tcPr>
+            <w:tcW w:w="1876" w:type="dxa"/>
+          </w:tcPr>
+          <w:p>
+            <w:pPr>
+              <w:pStyle w:val="Textoindependiente"/>
+              <w:jc w:val="center"/>
+              <w:rPr>
+                <w:sz w:val="24"/>
+                <w:szCs w:val="24"/>
+              </w:rPr>
+            </w:pPr>
+            <w:r>
+              <w:rPr>
+                <w:sz w:val="24"/>
+                <w:szCs w:val="24"/>
+              </w:rPr>
+              <w:t>1</w:t>
+            </w:r>
+            <w:r>
+              <w:rPr>
+                <w:sz w:val="24"/>
+                <w:szCs w:val="24"/>
+              </w:rPr>
+              <w:t>9</w:t>
+            </w:r>
+          </w:p>
+        </w:tc>
+        <w:tc>
+          <w:tcPr>
+            <w:tcW w:w="1876" w:type="dxa"/>
+          </w:tcPr>
+          <w:p>
+            <w:pPr>
+              <w:pStyle w:val="Textoindependiente"/>
+              <w:jc w:val="center"/>
+              <w:rPr>
+                <w:sz w:val="24"/>
+                <w:szCs w:val="24"/>
+              </w:rPr>
+            </w:pPr>
+            <w:r>
+              <w:rPr>
+                <w:sz w:val="24"/>
+                <w:szCs w:val="24"/>
+              </w:rPr>
+              <w:t>42</w:t>
+            </w:r>
+          </w:p>
+        </w:tc>
+      </w:tr>
+      <w:tr>
+        <w:tc>
+          <w:tcPr>
+            <w:tcW w:w="2427" w:type="dxa"/>
+          </w:tcPr>
+          <w:p>
+            <w:pPr>
+              <w:pStyle w:val="Textoindependiente"/>
+              <w:jc w:val="center"/>
+              <w:rPr>
+                <w:sz w:val="24"/>
+                <w:szCs w:val="24"/>
+                <w:u w:val="single"/>
+              </w:rPr>
+            </w:pPr>
+            <w:r>
+              <w:rPr>
+                <w:sz w:val="24"/>
+                <w:szCs w:val="24"/>
+                <w:u w:val="single"/>
+              </w:rPr>
+              <w:t>test09.txt</w:t>
+            </w:r>
+          </w:p>
+        </w:tc>
+        <w:tc>
+          <w:tcPr>
+            <w:tcW w:w="2315" w:type="dxa"/>
+          </w:tcPr>
+          <w:p>
+            <w:pPr>
+              <w:pStyle w:val="Textoindependiente"/>
+              <w:jc w:val="center"/>
+              <w:rPr>
+                <w:sz w:val="24"/>
+                <w:szCs w:val="24"/>
+              </w:rPr>
+            </w:pPr>
+            <w:r>
+              <w:rPr>
+                <w:sz w:val="24"/>
+                <w:szCs w:val="24"/>
+              </w:rPr>
+              <w:t>12</w:t>
+            </w:r>
+          </w:p>
+        </w:tc>
+        <w:tc>
+          <w:tcPr>
+            <w:tcW w:w="1876" w:type="dxa"/>
+          </w:tcPr>
+          <w:p>
+            <w:pPr>
+              <w:pStyle w:val="Textoindependiente"/>
+              <w:jc w:val="center"/>
+              <w:rPr>
+                <w:sz w:val="24"/>
+                <w:szCs w:val="24"/>
+              </w:rPr>
+            </w:pPr>
+            <w:r>
+              <w:rPr>
+                <w:sz w:val="24"/>
+                <w:szCs w:val="24"/>
+              </w:rPr>
+              <w:t>33</w:t>
+            </w:r>
+          </w:p>
+        </w:tc>
+        <w:tc>
+          <w:tcPr>
+            <w:tcW w:w="1876" w:type="dxa"/>
+          </w:tcPr>
+          <w:p>
+            <w:pPr>
+              <w:pStyle w:val="Textoindependiente"/>
+              <w:jc w:val="center"/>
+              <w:rPr>
+                <w:sz w:val="24"/>
+                <w:szCs w:val="24"/>
+              </w:rPr>
+            </w:pPr>
+            <w:r>
+              <w:rPr>
+                <w:sz w:val="24"/>
+                <w:szCs w:val="24"/>
+              </w:rPr>
+              <w:t>67</w:t>
+            </w:r>
+          </w:p>
+        </w:tc>
+      </w:tr>
+    </w:tbl>
+    <w:p>
+      <w:pPr>
+        <w:pStyle w:val="Textoindependiente"/>
+        <w:rPr>
+          <w:b/>
+          <w:sz w:val="2"/>
+          <w:szCs w:val="2"/>
+        </w:rPr>
+      </w:pPr>
     </w:p>
     <w:p>
       <w:pPr>
@@ -27482,667 +28555,669 @@
           <w:sz w:val="24"/>
           <w:szCs w:val="24"/>
         </w:rPr>
-        <w:t>Resultado de ejecutar AlmacenajeContenedoresRyP</w:t>
+        <w:t xml:space="preserve">Resultado de ejecutar </w:t>
+      </w:r>
+      <w:proofErr w:type="spellStart"/>
+      <w:r>
+        <w:rPr>
+          <w:b/>
+          <w:sz w:val="24"/>
+          <w:szCs w:val="24"/>
+        </w:rPr>
+        <w:t>AlmacenajeContenedoresRyP</w:t>
+      </w:r>
+      <w:proofErr w:type="spellEnd"/>
+      <w:r>
+        <w:rPr>
+          <w:b/>
+          <w:sz w:val="24"/>
+          <w:szCs w:val="24"/>
+        </w:rPr>
+        <w:t xml:space="preserve"> con el test09.txt</w:t>
+      </w:r>
+    </w:p>
+    <w:p>
+      <w:pPr>
+        <w:pStyle w:val="Textoindependiente"/>
+        <w:spacing w:after="0"/>
+        <w:rPr>
+          <w:sz w:val="24"/>
+          <w:szCs w:val="24"/>
+        </w:rPr>
+      </w:pPr>
+      <w:r>
+        <w:rPr>
+          <w:sz w:val="24"/>
+          <w:szCs w:val="24"/>
+        </w:rPr>
+        <w:t>Lista de contenedores y objetos contenidos:</w:t>
+      </w:r>
+    </w:p>
+    <w:p>
+      <w:pPr>
+        <w:pStyle w:val="Textoindependiente"/>
+        <w:spacing w:after="0"/>
+        <w:rPr>
+          <w:sz w:val="24"/>
+          <w:szCs w:val="24"/>
+        </w:rPr>
+      </w:pPr>
+    </w:p>
+    <w:p>
+      <w:pPr>
+        <w:pStyle w:val="Textoindependiente"/>
+        <w:spacing w:after="0"/>
+        <w:rPr>
+          <w:sz w:val="24"/>
+          <w:szCs w:val="24"/>
+        </w:rPr>
+      </w:pPr>
+      <w:r>
+        <w:rPr>
+          <w:sz w:val="24"/>
+          <w:szCs w:val="24"/>
+        </w:rPr>
+        <w:t>Contenedor 1: 19 1</w:t>
+      </w:r>
+    </w:p>
+    <w:p>
+      <w:pPr>
+        <w:pStyle w:val="Textoindependiente"/>
+        <w:spacing w:after="0"/>
+        <w:rPr>
+          <w:sz w:val="24"/>
+          <w:szCs w:val="24"/>
+        </w:rPr>
+      </w:pPr>
+      <w:r>
+        <w:rPr>
+          <w:sz w:val="24"/>
+          <w:szCs w:val="24"/>
+        </w:rPr>
+        <w:t>Contenedor 2: 18 2</w:t>
+      </w:r>
+    </w:p>
+    <w:p>
+      <w:pPr>
+        <w:pStyle w:val="Textoindependiente"/>
+        <w:spacing w:after="0"/>
+        <w:rPr>
+          <w:sz w:val="24"/>
+          <w:szCs w:val="24"/>
+        </w:rPr>
+      </w:pPr>
+      <w:r>
+        <w:rPr>
+          <w:sz w:val="24"/>
+          <w:szCs w:val="24"/>
+        </w:rPr>
+        <w:t>Contenedor 3: 18 2</w:t>
+      </w:r>
+    </w:p>
+    <w:p>
+      <w:pPr>
+        <w:pStyle w:val="Textoindependiente"/>
+        <w:spacing w:after="0"/>
+        <w:rPr>
+          <w:sz w:val="24"/>
+          <w:szCs w:val="24"/>
+        </w:rPr>
+      </w:pPr>
+      <w:r>
+        <w:rPr>
+          <w:sz w:val="24"/>
+          <w:szCs w:val="24"/>
+        </w:rPr>
+        <w:t>Contenedor 4: 17 3</w:t>
+      </w:r>
+    </w:p>
+    <w:p>
+      <w:pPr>
+        <w:pStyle w:val="Textoindependiente"/>
+        <w:spacing w:after="0"/>
+        <w:rPr>
+          <w:sz w:val="24"/>
+          <w:szCs w:val="24"/>
+        </w:rPr>
+      </w:pPr>
+      <w:r>
+        <w:rPr>
+          <w:sz w:val="24"/>
+          <w:szCs w:val="24"/>
+        </w:rPr>
+        <w:t>Contenedor 5: 17 3</w:t>
+      </w:r>
+    </w:p>
+    <w:p>
+      <w:pPr>
+        <w:pStyle w:val="Textoindependiente"/>
+        <w:spacing w:after="0"/>
+        <w:rPr>
+          <w:sz w:val="24"/>
+          <w:szCs w:val="24"/>
+        </w:rPr>
+      </w:pPr>
+      <w:r>
+        <w:rPr>
+          <w:sz w:val="24"/>
+          <w:szCs w:val="24"/>
+        </w:rPr>
+        <w:t>Contenedor 6: 17 3</w:t>
+      </w:r>
+    </w:p>
+    <w:p>
+      <w:pPr>
+        <w:pStyle w:val="Textoindependiente"/>
+        <w:spacing w:after="0"/>
+        <w:rPr>
+          <w:sz w:val="24"/>
+          <w:szCs w:val="24"/>
+        </w:rPr>
+      </w:pPr>
+      <w:r>
+        <w:rPr>
+          <w:sz w:val="24"/>
+          <w:szCs w:val="24"/>
+        </w:rPr>
+        <w:t>Contenedor 7: 16 4</w:t>
+      </w:r>
+    </w:p>
+    <w:p>
+      <w:pPr>
+        <w:pStyle w:val="Textoindependiente"/>
+        <w:spacing w:after="0"/>
+        <w:rPr>
+          <w:sz w:val="24"/>
+          <w:szCs w:val="24"/>
+        </w:rPr>
+      </w:pPr>
+      <w:r>
+        <w:rPr>
+          <w:sz w:val="24"/>
+          <w:szCs w:val="24"/>
+        </w:rPr>
+        <w:t>Contenedor 8: 16 4</w:t>
+      </w:r>
+    </w:p>
+    <w:p>
+      <w:pPr>
+        <w:pStyle w:val="Textoindependiente"/>
+        <w:spacing w:after="0"/>
+        <w:rPr>
+          <w:sz w:val="24"/>
+          <w:szCs w:val="24"/>
+        </w:rPr>
+      </w:pPr>
+      <w:r>
+        <w:rPr>
+          <w:sz w:val="24"/>
+          <w:szCs w:val="24"/>
+        </w:rPr>
+        <w:t>Contenedor 9: 16 4</w:t>
+      </w:r>
+    </w:p>
+    <w:p>
+      <w:pPr>
+        <w:pStyle w:val="Textoindependiente"/>
+        <w:spacing w:after="0"/>
+        <w:rPr>
+          <w:sz w:val="24"/>
+          <w:szCs w:val="24"/>
+        </w:rPr>
+      </w:pPr>
+      <w:r>
+        <w:rPr>
+          <w:sz w:val="24"/>
+          <w:szCs w:val="24"/>
+        </w:rPr>
+        <w:t>Contenedor 10: 16 4</w:t>
+      </w:r>
+    </w:p>
+    <w:p>
+      <w:pPr>
+        <w:pStyle w:val="Textoindependiente"/>
+        <w:spacing w:after="0"/>
+        <w:rPr>
+          <w:sz w:val="24"/>
+          <w:szCs w:val="24"/>
+        </w:rPr>
+      </w:pPr>
+      <w:r>
+        <w:rPr>
+          <w:sz w:val="24"/>
+          <w:szCs w:val="24"/>
+        </w:rPr>
+        <w:t>Contenedor 11: 15 5</w:t>
+      </w:r>
+    </w:p>
+    <w:p>
+      <w:pPr>
+        <w:pStyle w:val="Textoindependiente"/>
+        <w:spacing w:after="0"/>
+        <w:rPr>
+          <w:sz w:val="24"/>
+          <w:szCs w:val="24"/>
+        </w:rPr>
+      </w:pPr>
+      <w:r>
+        <w:rPr>
+          <w:sz w:val="24"/>
+          <w:szCs w:val="24"/>
+        </w:rPr>
+        <w:t>Contenedor 12: 15 5</w:t>
+      </w:r>
+    </w:p>
+    <w:p>
+      <w:pPr>
+        <w:pStyle w:val="Textoindependiente"/>
+        <w:spacing w:after="0"/>
+        <w:rPr>
+          <w:sz w:val="24"/>
+          <w:szCs w:val="24"/>
+        </w:rPr>
+      </w:pPr>
+      <w:r>
+        <w:rPr>
+          <w:sz w:val="24"/>
+          <w:szCs w:val="24"/>
+        </w:rPr>
+        <w:t>Contenedor 13: 15 5</w:t>
+      </w:r>
+    </w:p>
+    <w:p>
+      <w:pPr>
+        <w:pStyle w:val="Textoindependiente"/>
+        <w:spacing w:after="0"/>
+        <w:rPr>
+          <w:sz w:val="24"/>
+          <w:szCs w:val="24"/>
+        </w:rPr>
+      </w:pPr>
+      <w:r>
+        <w:rPr>
+          <w:sz w:val="24"/>
+          <w:szCs w:val="24"/>
+        </w:rPr>
+        <w:t>Contenedor 14: 15 5</w:t>
+      </w:r>
+    </w:p>
+    <w:p>
+      <w:pPr>
+        <w:pStyle w:val="Textoindependiente"/>
+        <w:spacing w:after="0"/>
+        <w:rPr>
+          <w:sz w:val="24"/>
+          <w:szCs w:val="24"/>
+        </w:rPr>
+      </w:pPr>
+      <w:r>
+        <w:rPr>
+          <w:sz w:val="24"/>
+          <w:szCs w:val="24"/>
+        </w:rPr>
+        <w:t>Contenedor 15: 14 6</w:t>
+      </w:r>
+    </w:p>
+    <w:p>
+      <w:pPr>
+        <w:pStyle w:val="Textoindependiente"/>
+        <w:spacing w:after="0"/>
+        <w:rPr>
+          <w:sz w:val="24"/>
+          <w:szCs w:val="24"/>
+        </w:rPr>
+      </w:pPr>
+      <w:r>
+        <w:rPr>
+          <w:sz w:val="24"/>
+          <w:szCs w:val="24"/>
+        </w:rPr>
+        <w:t>Contenedor 16: 14 6</w:t>
+      </w:r>
+    </w:p>
+    <w:p>
+      <w:pPr>
+        <w:pStyle w:val="Textoindependiente"/>
+        <w:spacing w:after="0"/>
+        <w:rPr>
+          <w:sz w:val="24"/>
+          <w:szCs w:val="24"/>
+        </w:rPr>
+      </w:pPr>
+      <w:r>
+        <w:rPr>
+          <w:sz w:val="24"/>
+          <w:szCs w:val="24"/>
+        </w:rPr>
+        <w:t>Contenedor 17: 14 6</w:t>
+      </w:r>
+    </w:p>
+    <w:p>
+      <w:pPr>
+        <w:pStyle w:val="Textoindependiente"/>
+        <w:spacing w:after="0"/>
+        <w:rPr>
+          <w:sz w:val="24"/>
+          <w:szCs w:val="24"/>
+        </w:rPr>
+      </w:pPr>
+      <w:r>
+        <w:rPr>
+          <w:sz w:val="24"/>
+          <w:szCs w:val="24"/>
+        </w:rPr>
+        <w:t>Contenedor 18: 14 6</w:t>
+      </w:r>
+    </w:p>
+    <w:p>
+      <w:pPr>
+        <w:pStyle w:val="Textoindependiente"/>
+        <w:spacing w:after="0"/>
+        <w:rPr>
+          <w:sz w:val="24"/>
+          <w:szCs w:val="24"/>
+        </w:rPr>
+      </w:pPr>
+      <w:r>
+        <w:rPr>
+          <w:sz w:val="24"/>
+          <w:szCs w:val="24"/>
+        </w:rPr>
+        <w:t>Contenedor 19: 13 7</w:t>
+      </w:r>
+    </w:p>
+    <w:p>
+      <w:pPr>
+        <w:pStyle w:val="Textoindependiente"/>
+        <w:spacing w:after="0"/>
+        <w:rPr>
+          <w:sz w:val="24"/>
+          <w:szCs w:val="24"/>
+        </w:rPr>
+      </w:pPr>
+      <w:r>
+        <w:rPr>
+          <w:sz w:val="24"/>
+          <w:szCs w:val="24"/>
+        </w:rPr>
+        <w:t>Contenedor 20: 13 7</w:t>
+      </w:r>
+    </w:p>
+    <w:p>
+      <w:pPr>
+        <w:pStyle w:val="Textoindependiente"/>
+        <w:spacing w:after="0"/>
+        <w:rPr>
+          <w:sz w:val="24"/>
+          <w:szCs w:val="24"/>
+        </w:rPr>
+      </w:pPr>
+      <w:r>
+        <w:rPr>
+          <w:sz w:val="24"/>
+          <w:szCs w:val="24"/>
+        </w:rPr>
+        <w:t>Contenedor 21: 13 7</w:t>
+      </w:r>
+    </w:p>
+    <w:p>
+      <w:pPr>
+        <w:pStyle w:val="Textoindependiente"/>
+        <w:spacing w:after="0"/>
+        <w:rPr>
+          <w:sz w:val="24"/>
+          <w:szCs w:val="24"/>
+        </w:rPr>
+      </w:pPr>
+      <w:r>
+        <w:rPr>
+          <w:sz w:val="24"/>
+          <w:szCs w:val="24"/>
+        </w:rPr>
+        <w:t>Contenedor 22: 13 7</w:t>
+      </w:r>
+    </w:p>
+    <w:p>
+      <w:pPr>
+        <w:pStyle w:val="Textoindependiente"/>
+        <w:spacing w:after="0"/>
+        <w:rPr>
+          <w:sz w:val="24"/>
+          <w:szCs w:val="24"/>
+        </w:rPr>
+      </w:pPr>
+      <w:r>
+        <w:rPr>
+          <w:sz w:val="24"/>
+          <w:szCs w:val="24"/>
+        </w:rPr>
+        <w:lastRenderedPageBreak/>
+        <w:t>Contenedor 23: 12 8</w:t>
+      </w:r>
+    </w:p>
+    <w:p>
+      <w:pPr>
+        <w:pStyle w:val="Textoindependiente"/>
+        <w:spacing w:after="0"/>
+        <w:rPr>
+          <w:sz w:val="24"/>
+          <w:szCs w:val="24"/>
+        </w:rPr>
+      </w:pPr>
+      <w:r>
+        <w:rPr>
+          <w:sz w:val="24"/>
+          <w:szCs w:val="24"/>
+        </w:rPr>
+        <w:t>Contenedor 24: 12 8</w:t>
+      </w:r>
+    </w:p>
+    <w:p>
+      <w:pPr>
+        <w:pStyle w:val="Textoindependiente"/>
+        <w:spacing w:after="0"/>
+        <w:rPr>
+          <w:sz w:val="24"/>
+          <w:szCs w:val="24"/>
+        </w:rPr>
+      </w:pPr>
+      <w:r>
+        <w:rPr>
+          <w:sz w:val="24"/>
+          <w:szCs w:val="24"/>
+        </w:rPr>
+        <w:t>Contenedor 25: 12 8</w:t>
+      </w:r>
+    </w:p>
+    <w:p>
+      <w:pPr>
+        <w:pStyle w:val="Textoindependiente"/>
+        <w:spacing w:after="0"/>
+        <w:rPr>
+          <w:sz w:val="24"/>
+          <w:szCs w:val="24"/>
+        </w:rPr>
+      </w:pPr>
+      <w:r>
+        <w:rPr>
+          <w:sz w:val="24"/>
+          <w:szCs w:val="24"/>
+        </w:rPr>
+        <w:t>Contenedor 26: 12 8</w:t>
+      </w:r>
+    </w:p>
+    <w:p>
+      <w:pPr>
+        <w:pStyle w:val="Textoindependiente"/>
+        <w:spacing w:after="0"/>
+        <w:rPr>
+          <w:sz w:val="24"/>
+          <w:szCs w:val="24"/>
+        </w:rPr>
+      </w:pPr>
+      <w:r>
+        <w:rPr>
+          <w:sz w:val="24"/>
+          <w:szCs w:val="24"/>
+        </w:rPr>
+        <w:t>Contenedor 27: 11 9</w:t>
+      </w:r>
+    </w:p>
+    <w:p>
+      <w:pPr>
+        <w:pStyle w:val="Textoindependiente"/>
+        <w:spacing w:after="0"/>
+        <w:rPr>
+          <w:sz w:val="24"/>
+          <w:szCs w:val="24"/>
+        </w:rPr>
+      </w:pPr>
+      <w:r>
+        <w:rPr>
+          <w:sz w:val="24"/>
+          <w:szCs w:val="24"/>
+        </w:rPr>
+        <w:t>Contenedor 28: 11 9</w:t>
+      </w:r>
+    </w:p>
+    <w:p>
+      <w:pPr>
+        <w:pStyle w:val="Textoindependiente"/>
+        <w:spacing w:after="0"/>
+        <w:rPr>
+          <w:sz w:val="24"/>
+          <w:szCs w:val="24"/>
+        </w:rPr>
+      </w:pPr>
+      <w:r>
+        <w:rPr>
+          <w:sz w:val="24"/>
+          <w:szCs w:val="24"/>
+        </w:rPr>
+        <w:t>Contenedor 29: 11 9</w:t>
+      </w:r>
+    </w:p>
+    <w:p>
+      <w:pPr>
+        <w:pStyle w:val="Textoindependiente"/>
+        <w:spacing w:after="0"/>
+        <w:rPr>
+          <w:sz w:val="24"/>
+          <w:szCs w:val="24"/>
+        </w:rPr>
+      </w:pPr>
+      <w:r>
+        <w:rPr>
+          <w:sz w:val="24"/>
+          <w:szCs w:val="24"/>
+        </w:rPr>
+        <w:t>Contenedor 30: 11 9</w:t>
+      </w:r>
+    </w:p>
+    <w:p>
+      <w:pPr>
+        <w:pStyle w:val="Textoindependiente"/>
+        <w:spacing w:after="0"/>
+        <w:rPr>
+          <w:sz w:val="24"/>
+          <w:szCs w:val="24"/>
+        </w:rPr>
+      </w:pPr>
+      <w:r>
+        <w:rPr>
+          <w:sz w:val="24"/>
+          <w:szCs w:val="24"/>
+        </w:rPr>
+        <w:t>Contenedor 31: 10 10</w:t>
+      </w:r>
+    </w:p>
+    <w:p>
+      <w:pPr>
+        <w:pStyle w:val="Textoindependiente"/>
+        <w:spacing w:after="0"/>
+        <w:rPr>
+          <w:sz w:val="24"/>
+          <w:szCs w:val="24"/>
+        </w:rPr>
+      </w:pPr>
+      <w:r>
+        <w:rPr>
+          <w:sz w:val="24"/>
+          <w:szCs w:val="24"/>
+        </w:rPr>
+        <w:t>Contenedor 32: 10 10</w:t>
+      </w:r>
+    </w:p>
+    <w:p>
+      <w:pPr>
+        <w:pStyle w:val="Textoindependiente"/>
+        <w:spacing w:after="0"/>
+        <w:rPr>
+          <w:sz w:val="24"/>
+          <w:szCs w:val="24"/>
+        </w:rPr>
+      </w:pPr>
+      <w:r>
+        <w:rPr>
+          <w:sz w:val="24"/>
+          <w:szCs w:val="24"/>
+        </w:rPr>
+        <w:t>Contenedor 33: 3 1</w:t>
+      </w:r>
+    </w:p>
+    <w:p>
+      <w:pPr>
+        <w:pStyle w:val="Textoindependiente"/>
+        <w:spacing w:after="0"/>
+        <w:rPr>
+          <w:sz w:val="24"/>
+          <w:szCs w:val="24"/>
+        </w:rPr>
+      </w:pPr>
+    </w:p>
+    <w:p>
+      <w:pPr>
+        <w:pStyle w:val="Textoindependiente"/>
+        <w:spacing w:after="0"/>
+        <w:rPr>
+          <w:b/>
+          <w:sz w:val="24"/>
+          <w:szCs w:val="24"/>
+        </w:rPr>
+      </w:pPr>
+      <w:r>
+        <w:rPr>
+          <w:b/>
+          <w:sz w:val="24"/>
+          <w:szCs w:val="24"/>
+        </w:rPr>
+        <w:t>Conclusión</w:t>
+      </w:r>
+    </w:p>
+    <w:p>
+      <w:pPr>
+        <w:pStyle w:val="Textoindependiente"/>
+        <w:spacing w:after="0"/>
+        <w:rPr>
+          <w:sz w:val="24"/>
+          <w:szCs w:val="24"/>
+        </w:rPr>
+      </w:pPr>
+      <w:r>
+        <w:rPr>
+          <w:sz w:val="24"/>
+          <w:szCs w:val="24"/>
+        </w:rPr>
+        <w:t>Hacer la poda de esta manera permite poder calcular los contenedores necesarios para el test09.txt, ya que se podan muchas posibles ramas, y como consecuencia reduce mucho el número de llamadas. El aspecto negativo es que el algoritmo para calcular el mejor, al ser un algoritmo hecho en clase, puede ser improductivo y hacer que el número</w:t>
       </w:r>
       <w:bookmarkStart w:id="0" w:name="_GoBack"/>
       <w:bookmarkEnd w:id="0"/>
       <w:r>
         <w:rPr>
-          <w:b/>
-          <w:sz w:val="24"/>
-          <w:szCs w:val="24"/>
-        </w:rPr>
-        <w:t xml:space="preserve"> con el test09.txt</w:t>
-      </w:r>
-    </w:p>
-    <w:p>
-      <w:pPr>
-        <w:pStyle w:val="Textoindependiente"/>
-        <w:spacing w:after="0"/>
-        <w:rPr>
-          <w:sz w:val="24"/>
-          <w:szCs w:val="24"/>
-        </w:rPr>
-      </w:pPr>
-      <w:r>
-        <w:rPr>
-          <w:sz w:val="24"/>
-          <w:szCs w:val="24"/>
-        </w:rPr>
-        <w:t>Lista de contenedores y objetos contenidos:</w:t>
-      </w:r>
-    </w:p>
-    <w:p>
-      <w:pPr>
-        <w:pStyle w:val="Textoindependiente"/>
-        <w:spacing w:after="0"/>
-        <w:rPr>
-          <w:sz w:val="24"/>
-          <w:szCs w:val="24"/>
-        </w:rPr>
-      </w:pPr>
-    </w:p>
-    <w:p>
-      <w:pPr>
-        <w:pStyle w:val="Textoindependiente"/>
-        <w:spacing w:after="0"/>
-        <w:rPr>
-          <w:sz w:val="24"/>
-          <w:szCs w:val="24"/>
-        </w:rPr>
-      </w:pPr>
-      <w:r>
-        <w:rPr>
-          <w:sz w:val="24"/>
-          <w:szCs w:val="24"/>
-        </w:rPr>
-        <w:t>Contenedor 1: 19 1</w:t>
-      </w:r>
-    </w:p>
-    <w:p>
-      <w:pPr>
-        <w:pStyle w:val="Textoindependiente"/>
-        <w:spacing w:after="0"/>
-        <w:rPr>
-          <w:sz w:val="24"/>
-          <w:szCs w:val="24"/>
-        </w:rPr>
-      </w:pPr>
-      <w:r>
-        <w:rPr>
-          <w:sz w:val="24"/>
-          <w:szCs w:val="24"/>
-        </w:rPr>
-        <w:t>Contenedor 2: 18 2</w:t>
-      </w:r>
-    </w:p>
-    <w:p>
-      <w:pPr>
-        <w:pStyle w:val="Textoindependiente"/>
-        <w:spacing w:after="0"/>
-        <w:rPr>
-          <w:sz w:val="24"/>
-          <w:szCs w:val="24"/>
-        </w:rPr>
-      </w:pPr>
-      <w:r>
-        <w:rPr>
-          <w:sz w:val="24"/>
-          <w:szCs w:val="24"/>
-        </w:rPr>
-        <w:t>Contenedor 3: 18 2</w:t>
-      </w:r>
-    </w:p>
-    <w:p>
-      <w:pPr>
-        <w:pStyle w:val="Textoindependiente"/>
-        <w:spacing w:after="0"/>
-        <w:rPr>
-          <w:sz w:val="24"/>
-          <w:szCs w:val="24"/>
-        </w:rPr>
-      </w:pPr>
-      <w:r>
-        <w:rPr>
-          <w:sz w:val="24"/>
-          <w:szCs w:val="24"/>
-        </w:rPr>
-        <w:t>Contenedor 4: 17 3</w:t>
-      </w:r>
-    </w:p>
-    <w:p>
-      <w:pPr>
-        <w:pStyle w:val="Textoindependiente"/>
-        <w:spacing w:after="0"/>
-        <w:rPr>
-          <w:sz w:val="24"/>
-          <w:szCs w:val="24"/>
-        </w:rPr>
-      </w:pPr>
-      <w:r>
-        <w:rPr>
-          <w:sz w:val="24"/>
-          <w:szCs w:val="24"/>
-        </w:rPr>
-        <w:t>Contenedor 5: 17 3</w:t>
-      </w:r>
-    </w:p>
-    <w:p>
-      <w:pPr>
-        <w:pStyle w:val="Textoindependiente"/>
-        <w:spacing w:after="0"/>
-        <w:rPr>
-          <w:sz w:val="24"/>
-          <w:szCs w:val="24"/>
-        </w:rPr>
-      </w:pPr>
-      <w:r>
-        <w:rPr>
-          <w:sz w:val="24"/>
-          <w:szCs w:val="24"/>
-        </w:rPr>
-        <w:t>Contenedor 6: 17 3</w:t>
-      </w:r>
-    </w:p>
-    <w:p>
-      <w:pPr>
-        <w:pStyle w:val="Textoindependiente"/>
-        <w:spacing w:after="0"/>
-        <w:rPr>
-          <w:sz w:val="24"/>
-          <w:szCs w:val="24"/>
-        </w:rPr>
-      </w:pPr>
-      <w:r>
-        <w:rPr>
-          <w:sz w:val="24"/>
-          <w:szCs w:val="24"/>
-        </w:rPr>
-        <w:t>Contenedor 7: 16 4</w:t>
-      </w:r>
-    </w:p>
-    <w:p>
-      <w:pPr>
-        <w:pStyle w:val="Textoindependiente"/>
-        <w:spacing w:after="0"/>
-        <w:rPr>
-          <w:sz w:val="24"/>
-          <w:szCs w:val="24"/>
-        </w:rPr>
-      </w:pPr>
-      <w:r>
-        <w:rPr>
-          <w:sz w:val="24"/>
-          <w:szCs w:val="24"/>
-        </w:rPr>
-        <w:t>Contenedor 8: 16 4</w:t>
-      </w:r>
-    </w:p>
-    <w:p>
-      <w:pPr>
-        <w:pStyle w:val="Textoindependiente"/>
-        <w:spacing w:after="0"/>
-        <w:rPr>
-          <w:sz w:val="24"/>
-          <w:szCs w:val="24"/>
-        </w:rPr>
-      </w:pPr>
-      <w:r>
-        <w:rPr>
-          <w:sz w:val="24"/>
-          <w:szCs w:val="24"/>
-        </w:rPr>
-        <w:t>Contenedor 9: 16 4</w:t>
-      </w:r>
-    </w:p>
-    <w:p>
-      <w:pPr>
-        <w:pStyle w:val="Textoindependiente"/>
-        <w:spacing w:after="0"/>
-        <w:rPr>
-          <w:sz w:val="24"/>
-          <w:szCs w:val="24"/>
-        </w:rPr>
-      </w:pPr>
-      <w:r>
-        <w:rPr>
-          <w:sz w:val="24"/>
-          <w:szCs w:val="24"/>
-        </w:rPr>
-        <w:t>Contenedor 10: 16 4</w:t>
-      </w:r>
-    </w:p>
-    <w:p>
-      <w:pPr>
-        <w:pStyle w:val="Textoindependiente"/>
-        <w:spacing w:after="0"/>
-        <w:rPr>
-          <w:sz w:val="24"/>
-          <w:szCs w:val="24"/>
-        </w:rPr>
-      </w:pPr>
-      <w:r>
-        <w:rPr>
-          <w:sz w:val="24"/>
-          <w:szCs w:val="24"/>
-        </w:rPr>
-        <w:t>Contenedor 11: 15 5</w:t>
-      </w:r>
-    </w:p>
-    <w:p>
-      <w:pPr>
-        <w:pStyle w:val="Textoindependiente"/>
-        <w:spacing w:after="0"/>
-        <w:rPr>
-          <w:sz w:val="24"/>
-          <w:szCs w:val="24"/>
-        </w:rPr>
-      </w:pPr>
-      <w:r>
-        <w:rPr>
-          <w:sz w:val="24"/>
-          <w:szCs w:val="24"/>
-        </w:rPr>
-        <w:t>Contenedor 12: 15 5</w:t>
-      </w:r>
-    </w:p>
-    <w:p>
-      <w:pPr>
-        <w:pStyle w:val="Textoindependiente"/>
-        <w:spacing w:after="0"/>
-        <w:rPr>
-          <w:sz w:val="24"/>
-          <w:szCs w:val="24"/>
-        </w:rPr>
-      </w:pPr>
-      <w:r>
-        <w:rPr>
-          <w:sz w:val="24"/>
-          <w:szCs w:val="24"/>
-        </w:rPr>
-        <w:t>Contenedor 13: 15 5</w:t>
-      </w:r>
-    </w:p>
-    <w:p>
-      <w:pPr>
-        <w:pStyle w:val="Textoindependiente"/>
-        <w:spacing w:after="0"/>
-        <w:rPr>
-          <w:sz w:val="24"/>
-          <w:szCs w:val="24"/>
-        </w:rPr>
-      </w:pPr>
-      <w:r>
-        <w:rPr>
-          <w:sz w:val="24"/>
-          <w:szCs w:val="24"/>
-        </w:rPr>
-        <w:t>Contenedor 14: 15 5</w:t>
-      </w:r>
-    </w:p>
-    <w:p>
-      <w:pPr>
-        <w:pStyle w:val="Textoindependiente"/>
-        <w:spacing w:after="0"/>
-        <w:rPr>
-          <w:sz w:val="24"/>
-          <w:szCs w:val="24"/>
-        </w:rPr>
-      </w:pPr>
-      <w:r>
-        <w:rPr>
-          <w:sz w:val="24"/>
-          <w:szCs w:val="24"/>
-        </w:rPr>
-        <w:t>Contenedor 15: 14 6</w:t>
-      </w:r>
-    </w:p>
-    <w:p>
-      <w:pPr>
-        <w:pStyle w:val="Textoindependiente"/>
-        <w:spacing w:after="0"/>
-        <w:rPr>
-          <w:sz w:val="24"/>
-          <w:szCs w:val="24"/>
-        </w:rPr>
-      </w:pPr>
-      <w:r>
-        <w:rPr>
-          <w:sz w:val="24"/>
-          <w:szCs w:val="24"/>
-        </w:rPr>
-        <w:t>Contenedor 16: 14 6</w:t>
-      </w:r>
-    </w:p>
-    <w:p>
-      <w:pPr>
-        <w:pStyle w:val="Textoindependiente"/>
-        <w:spacing w:after="0"/>
-        <w:rPr>
-          <w:sz w:val="24"/>
-          <w:szCs w:val="24"/>
-        </w:rPr>
-      </w:pPr>
-      <w:r>
-        <w:rPr>
-          <w:sz w:val="24"/>
-          <w:szCs w:val="24"/>
-        </w:rPr>
-        <w:t>Contenedor 17: 14 6</w:t>
-      </w:r>
-    </w:p>
-    <w:p>
-      <w:pPr>
-        <w:pStyle w:val="Textoindependiente"/>
-        <w:spacing w:after="0"/>
-        <w:rPr>
-          <w:sz w:val="24"/>
-          <w:szCs w:val="24"/>
-        </w:rPr>
-      </w:pPr>
-      <w:r>
-        <w:rPr>
-          <w:sz w:val="24"/>
-          <w:szCs w:val="24"/>
-        </w:rPr>
-        <w:t>Contenedor 18: 14 6</w:t>
-      </w:r>
-    </w:p>
-    <w:p>
-      <w:pPr>
-        <w:pStyle w:val="Textoindependiente"/>
-        <w:spacing w:after="0"/>
-        <w:rPr>
-          <w:sz w:val="24"/>
-          <w:szCs w:val="24"/>
-        </w:rPr>
-      </w:pPr>
-      <w:r>
-        <w:rPr>
-          <w:sz w:val="24"/>
-          <w:szCs w:val="24"/>
-        </w:rPr>
-        <w:t>Contenedor 19: 13 7</w:t>
-      </w:r>
-    </w:p>
-    <w:p>
-      <w:pPr>
-        <w:pStyle w:val="Textoindependiente"/>
-        <w:spacing w:after="0"/>
-        <w:rPr>
-          <w:sz w:val="24"/>
-          <w:szCs w:val="24"/>
-        </w:rPr>
-      </w:pPr>
-      <w:r>
-        <w:rPr>
-          <w:sz w:val="24"/>
-          <w:szCs w:val="24"/>
-        </w:rPr>
-        <w:t>Contenedor 20: 13 7</w:t>
-      </w:r>
-    </w:p>
-    <w:p>
-      <w:pPr>
-        <w:pStyle w:val="Textoindependiente"/>
-        <w:spacing w:after="0"/>
-        <w:rPr>
-          <w:sz w:val="24"/>
-          <w:szCs w:val="24"/>
-        </w:rPr>
-      </w:pPr>
-      <w:r>
-        <w:rPr>
-          <w:sz w:val="24"/>
-          <w:szCs w:val="24"/>
-        </w:rPr>
-        <w:t>Contenedor 21: 13 7</w:t>
-      </w:r>
-    </w:p>
-    <w:p>
-      <w:pPr>
-        <w:pStyle w:val="Textoindependiente"/>
-        <w:spacing w:after="0"/>
-        <w:rPr>
-          <w:sz w:val="24"/>
-          <w:szCs w:val="24"/>
-        </w:rPr>
-      </w:pPr>
-      <w:r>
-        <w:rPr>
-          <w:sz w:val="24"/>
-          <w:szCs w:val="24"/>
-        </w:rPr>
-        <w:t>Contenedor 22: 13 7</w:t>
-      </w:r>
-    </w:p>
-    <w:p>
-      <w:pPr>
-        <w:pStyle w:val="Textoindependiente"/>
-        <w:spacing w:after="0"/>
-        <w:rPr>
-          <w:sz w:val="24"/>
-          <w:szCs w:val="24"/>
-        </w:rPr>
-      </w:pPr>
-      <w:r>
-        <w:rPr>
-          <w:sz w:val="24"/>
-          <w:szCs w:val="24"/>
-        </w:rPr>
-        <w:t>Contenedor 23: 12 8</w:t>
-      </w:r>
-    </w:p>
-    <w:p>
-      <w:pPr>
-        <w:pStyle w:val="Textoindependiente"/>
-        <w:spacing w:after="0"/>
-        <w:rPr>
-          <w:sz w:val="24"/>
-          <w:szCs w:val="24"/>
-        </w:rPr>
-      </w:pPr>
-      <w:r>
-        <w:rPr>
-          <w:sz w:val="24"/>
-          <w:szCs w:val="24"/>
-        </w:rPr>
-        <w:t>Contenedor 24: 12 8</w:t>
-      </w:r>
-    </w:p>
-    <w:p>
-      <w:pPr>
-        <w:pStyle w:val="Textoindependiente"/>
-        <w:spacing w:after="0"/>
-        <w:rPr>
-          <w:sz w:val="24"/>
-          <w:szCs w:val="24"/>
-        </w:rPr>
-      </w:pPr>
-      <w:r>
-        <w:rPr>
-          <w:sz w:val="24"/>
-          <w:szCs w:val="24"/>
-        </w:rPr>
-        <w:t>Contenedor 25: 12 8</w:t>
-      </w:r>
-    </w:p>
-    <w:p>
-      <w:pPr>
-        <w:pStyle w:val="Textoindependiente"/>
-        <w:spacing w:after="0"/>
-        <w:rPr>
-          <w:sz w:val="24"/>
-          <w:szCs w:val="24"/>
-        </w:rPr>
-      </w:pPr>
-      <w:r>
-        <w:rPr>
-          <w:sz w:val="24"/>
-          <w:szCs w:val="24"/>
-        </w:rPr>
-        <w:t>Contenedor 26: 12 8</w:t>
-      </w:r>
-    </w:p>
-    <w:p>
-      <w:pPr>
-        <w:pStyle w:val="Textoindependiente"/>
-        <w:spacing w:after="0"/>
-        <w:rPr>
-          <w:sz w:val="24"/>
-          <w:szCs w:val="24"/>
-        </w:rPr>
-      </w:pPr>
-      <w:r>
-        <w:rPr>
-          <w:sz w:val="24"/>
-          <w:szCs w:val="24"/>
-        </w:rPr>
-        <w:t>Contenedor 27: 11 9</w:t>
-      </w:r>
-    </w:p>
-    <w:p>
-      <w:pPr>
-        <w:pStyle w:val="Textoindependiente"/>
-        <w:spacing w:after="0"/>
-        <w:rPr>
-          <w:sz w:val="24"/>
-          <w:szCs w:val="24"/>
-        </w:rPr>
-      </w:pPr>
-      <w:r>
-        <w:rPr>
-          <w:sz w:val="24"/>
-          <w:szCs w:val="24"/>
-        </w:rPr>
-        <w:t>Contenedor 28: 11 9</w:t>
-      </w:r>
-    </w:p>
-    <w:p>
-      <w:pPr>
-        <w:pStyle w:val="Textoindependiente"/>
-        <w:spacing w:after="0"/>
-        <w:rPr>
-          <w:sz w:val="24"/>
-          <w:szCs w:val="24"/>
-        </w:rPr>
-      </w:pPr>
-      <w:r>
-        <w:rPr>
-          <w:sz w:val="24"/>
-          <w:szCs w:val="24"/>
-        </w:rPr>
-        <w:t>Contenedor 29: 11 9</w:t>
-      </w:r>
-    </w:p>
-    <w:p>
-      <w:pPr>
-        <w:pStyle w:val="Textoindependiente"/>
-        <w:spacing w:after="0"/>
-        <w:rPr>
-          <w:sz w:val="24"/>
-          <w:szCs w:val="24"/>
-        </w:rPr>
-      </w:pPr>
-      <w:r>
-        <w:rPr>
-          <w:sz w:val="24"/>
-          <w:szCs w:val="24"/>
-        </w:rPr>
-        <w:t>Contenedor 30: 11 9</w:t>
-      </w:r>
-    </w:p>
-    <w:p>
-      <w:pPr>
-        <w:pStyle w:val="Textoindependiente"/>
-        <w:spacing w:after="0"/>
-        <w:rPr>
-          <w:sz w:val="24"/>
-          <w:szCs w:val="24"/>
-        </w:rPr>
-      </w:pPr>
-      <w:r>
-        <w:rPr>
-          <w:sz w:val="24"/>
-          <w:szCs w:val="24"/>
-        </w:rPr>
-        <w:t>Contenedor 31: 10 10</w:t>
-      </w:r>
-    </w:p>
-    <w:p>
-      <w:pPr>
-        <w:pStyle w:val="Textoindependiente"/>
-        <w:spacing w:after="0"/>
-        <w:rPr>
-          <w:sz w:val="24"/>
-          <w:szCs w:val="24"/>
-        </w:rPr>
-      </w:pPr>
-      <w:r>
-        <w:rPr>
-          <w:sz w:val="24"/>
-          <w:szCs w:val="24"/>
-        </w:rPr>
-        <w:t>Contenedor 32: 10 10</w:t>
-      </w:r>
-    </w:p>
-    <w:p>
-      <w:pPr>
-        <w:pStyle w:val="Textoindependiente"/>
-        <w:spacing w:after="0"/>
-        <w:rPr>
-          <w:sz w:val="24"/>
-          <w:szCs w:val="24"/>
-        </w:rPr>
-      </w:pPr>
-      <w:r>
-        <w:rPr>
-          <w:sz w:val="24"/>
-          <w:szCs w:val="24"/>
-        </w:rPr>
-        <w:t>Contenedor 33: 3 1</w:t>
-      </w:r>
-    </w:p>
-    <w:p>
-      <w:pPr>
-        <w:pStyle w:val="Textoindependiente"/>
-        <w:spacing w:after="0"/>
-        <w:rPr>
-          <w:sz w:val="24"/>
-          <w:szCs w:val="24"/>
-        </w:rPr>
-      </w:pPr>
-    </w:p>
-    <w:p>
-      <w:pPr>
-        <w:pStyle w:val="Textoindependiente"/>
-        <w:spacing w:after="0"/>
-        <w:rPr>
-          <w:sz w:val="24"/>
-          <w:szCs w:val="24"/>
-        </w:rPr>
-      </w:pPr>
-      <w:r>
-        <w:rPr>
-          <w:sz w:val="24"/>
-          <w:szCs w:val="24"/>
-        </w:rPr>
-        <w:t>El número de contenedores necesario es 33</w:t>
-      </w:r>
-    </w:p>
-    <w:p>
-      <w:pPr>
-        <w:pStyle w:val="Textoindependiente"/>
-        <w:spacing w:after="0"/>
-        <w:rPr>
-          <w:sz w:val="24"/>
-          <w:szCs w:val="24"/>
-        </w:rPr>
-      </w:pPr>
-      <w:r>
-        <w:rPr>
-          <w:sz w:val="24"/>
-          <w:szCs w:val="24"/>
-        </w:rPr>
-        <w:t>Número de llamadas recursivas: 67</w:t>
-      </w:r>
-    </w:p>
-    <w:p>
-      <w:pPr>
-        <w:pStyle w:val="Textoindependiente"/>
-        <w:spacing w:after="0"/>
-        <w:rPr>
-          <w:sz w:val="24"/>
-          <w:szCs w:val="24"/>
-          <w:u w:val="single"/>
-        </w:rPr>
-      </w:pPr>
-      <w:r>
-        <w:rPr>
-          <w:sz w:val="24"/>
-          <w:szCs w:val="24"/>
-        </w:rPr>
-        <w:t>test09.txt      10</w:t>
+          <w:sz w:val="24"/>
+          <w:szCs w:val="24"/>
+        </w:rPr>
+        <w:t xml:space="preserve"> de contenedores en una solución muy sencilla sea mayor, como pasa con el caso más básico que es el test00.txt.</w:t>
       </w:r>
     </w:p>
     <w:sectPr>
@@ -28548,7 +29623,7 @@
   <w:style w:type="paragraph" w:default="1" w:styleId="Normal">
     <w:name w:val="Normal"/>
     <w:qFormat/>
-    <w:rsid w:val="000B566E"/>
+    <w:rsid w:val="00EB3737"/>
   </w:style>
   <w:style w:type="paragraph" w:styleId="Ttulo1">
     <w:name w:val="heading 1"/>
@@ -29080,7 +30155,7 @@
 </file>
 
 <file path=customXml/itemProps1.xml><?xml version="1.0" encoding="utf-8"?>
-<ds:datastoreItem xmlns:ds="http://schemas.openxmlformats.org/officeDocument/2006/customXml" ds:itemID="{08120D71-CD3D-455B-A5C0-5C67DDE5F7B9}">
+<ds:datastoreItem xmlns:ds="http://schemas.openxmlformats.org/officeDocument/2006/customXml" ds:itemID="{4844D88D-8920-4649-BAB1-639989B65F05}">
   <ds:schemaRefs>
     <ds:schemaRef ds:uri="http://schemas.openxmlformats.org/officeDocument/2006/bibliography"/>
   </ds:schemaRefs>

</xml_diff>